<commit_message>
Tag findings by quality dimensions across Bugs, Strengths, Suggestions
Map functionality, workflow, stability, usability, and performance into
entry tags, a coverage matrix, and test-case columns so the report shows
balanced product-quality evaluation—not usability-only strengths.

Co-authored-by: Showravkarmakar <Showrav88@users.noreply.github.com>
</commit_message>
<xml_diff>
--- a/SQA_Intern_Assignment_Test_Report_DRAFT.docx
+++ b/SQA_Intern_Assignment_Test_Report_DRAFT.docx
@@ -37,7 +37,6 @@
     <w:tbl>
       <w:tblPr>
         <w:tblW w:type="auto" w:w="0"/>
-        <w:tblLayout w:type="autofit"/>
         <w:tblLook w:firstColumn="1" w:firstRow="1" w:lastColumn="0" w:lastRow="0" w:noHBand="0" w:noVBand="1" w:val="04A0"/>
       </w:tblPr>
       <w:tblGrid>
@@ -405,7 +404,7 @@
     </w:p>
     <w:p>
       <w:pPr>
-        <w:spacing w:after="120" w:before="0"/>
+        <w:spacing w:after="120"/>
       </w:pPr>
       <w:r>
         <w:rPr>
@@ -415,12 +414,168 @@
           <w:color w:val="333333"/>
           <w:sz w:val="22"/>
         </w:rPr>
-        <w:t>This report documents functional, usability, stability, and workflow testing of the Auto Background Remover app, focused on the Homepage modules: Background Remove and Batch Remover. Per assignment guidance, evaluation does not judge AI background-removal accuracy (third-party API). Focus is on app functionality, workflow, stability, usability, performance, and overall product quality.</w:t>
+        <w:t>This report documents testing of the Auto Background Remover app for Homepage modules: Background Remove and Batch Remover. Per assignment guidance, AI cutout perfection is out of scope. Evaluation focuses on six product-quality dimensions:</w:t>
       </w:r>
     </w:p>
     <w:p>
       <w:pPr>
-        <w:spacing w:after="120" w:before="0"/>
+        <w:spacing w:after="60"/>
+        <w:ind w:left="170"/>
+      </w:pPr>
+      <w:r>
+        <w:rPr>
+          <w:rFonts w:ascii="Calibri" w:hAnsi="Calibri" w:eastAsia="Calibri"/>
+          <w:b/>
+          <w:i w:val="0"/>
+          <w:color w:val="1F4E79"/>
+          <w:sz w:val="20"/>
+        </w:rPr>
+        <w:t xml:space="preserve">• Functionality: </w:t>
+      </w:r>
+      <w:r>
+        <w:rPr>
+          <w:rFonts w:ascii="Calibri" w:hAnsi="Calibri" w:eastAsia="Calibri"/>
+          <w:b w:val="0"/>
+          <w:i w:val="0"/>
+          <w:color w:val="333333"/>
+          <w:sz w:val="20"/>
+        </w:rPr>
+        <w:t>Do features work as intended? Correct options, actions, outputs, validation.</w:t>
+      </w:r>
+    </w:p>
+    <w:p>
+      <w:pPr>
+        <w:spacing w:after="60"/>
+        <w:ind w:left="170"/>
+      </w:pPr>
+      <w:r>
+        <w:rPr>
+          <w:rFonts w:ascii="Calibri" w:hAnsi="Calibri" w:eastAsia="Calibri"/>
+          <w:b/>
+          <w:i w:val="0"/>
+          <w:color w:val="1F4E79"/>
+          <w:sz w:val="20"/>
+        </w:rPr>
+        <w:t xml:space="preserve">• Workflow: </w:t>
+      </w:r>
+      <w:r>
+        <w:rPr>
+          <w:rFonts w:ascii="Calibri" w:hAnsi="Calibri" w:eastAsia="Calibri"/>
+          <w:b w:val="0"/>
+          <w:i w:val="0"/>
+          <w:color w:val="333333"/>
+          <w:sz w:val="20"/>
+        </w:rPr>
+        <w:t>Is the end-to-end user path clear and complete? (open → select → process → save/share → back)</w:t>
+      </w:r>
+    </w:p>
+    <w:p>
+      <w:pPr>
+        <w:spacing w:after="60"/>
+        <w:ind w:left="170"/>
+      </w:pPr>
+      <w:r>
+        <w:rPr>
+          <w:rFonts w:ascii="Calibri" w:hAnsi="Calibri" w:eastAsia="Calibri"/>
+          <w:b/>
+          <w:i w:val="0"/>
+          <w:color w:val="1F4E79"/>
+          <w:sz w:val="20"/>
+        </w:rPr>
+        <w:t xml:space="preserve">• Stability: </w:t>
+      </w:r>
+      <w:r>
+        <w:rPr>
+          <w:rFonts w:ascii="Calibri" w:hAnsi="Calibri" w:eastAsia="Calibri"/>
+          <w:b w:val="0"/>
+          <w:i w:val="0"/>
+          <w:color w:val="333333"/>
+          <w:sz w:val="20"/>
+        </w:rPr>
+        <w:t>Does the app stay reliable? No crash, freeze, blank screen, broken state after cancel/back.</w:t>
+      </w:r>
+    </w:p>
+    <w:p>
+      <w:pPr>
+        <w:spacing w:after="60"/>
+        <w:ind w:left="170"/>
+      </w:pPr>
+      <w:r>
+        <w:rPr>
+          <w:rFonts w:ascii="Calibri" w:hAnsi="Calibri" w:eastAsia="Calibri"/>
+          <w:b/>
+          <w:i w:val="0"/>
+          <w:color w:val="1F4E79"/>
+          <w:sz w:val="20"/>
+        </w:rPr>
+        <w:t xml:space="preserve">• Usability: </w:t>
+      </w:r>
+      <w:r>
+        <w:rPr>
+          <w:rFonts w:ascii="Calibri" w:hAnsi="Calibri" w:eastAsia="Calibri"/>
+          <w:b w:val="0"/>
+          <w:i w:val="0"/>
+          <w:color w:val="333333"/>
+          <w:sz w:val="20"/>
+        </w:rPr>
+        <w:t>Is it easy and clear? Labels, feedback, empty states, errors, navigation, touch targets.</w:t>
+      </w:r>
+    </w:p>
+    <w:p>
+      <w:pPr>
+        <w:spacing w:after="60"/>
+        <w:ind w:left="170"/>
+      </w:pPr>
+      <w:r>
+        <w:rPr>
+          <w:rFonts w:ascii="Calibri" w:hAnsi="Calibri" w:eastAsia="Calibri"/>
+          <w:b/>
+          <w:i w:val="0"/>
+          <w:color w:val="1F4E79"/>
+          <w:sz w:val="20"/>
+        </w:rPr>
+        <w:t xml:space="preserve">• Performance: </w:t>
+      </w:r>
+      <w:r>
+        <w:rPr>
+          <w:rFonts w:ascii="Calibri" w:hAnsi="Calibri" w:eastAsia="Calibri"/>
+          <w:b w:val="0"/>
+          <w:i w:val="0"/>
+          <w:color w:val="333333"/>
+          <w:sz w:val="20"/>
+        </w:rPr>
+        <w:t>Does it feel responsive? Loading time, progress feedback, batch with multiple images.</w:t>
+      </w:r>
+    </w:p>
+    <w:p>
+      <w:pPr>
+        <w:spacing w:after="60"/>
+        <w:ind w:left="170"/>
+      </w:pPr>
+      <w:r>
+        <w:rPr>
+          <w:rFonts w:ascii="Calibri" w:hAnsi="Calibri" w:eastAsia="Calibri"/>
+          <w:b/>
+          <w:i w:val="0"/>
+          <w:color w:val="1F4E79"/>
+          <w:sz w:val="20"/>
+        </w:rPr>
+        <w:t xml:space="preserve">• Overall Product Quality: </w:t>
+      </w:r>
+      <w:r>
+        <w:rPr>
+          <w:rFonts w:ascii="Calibri" w:hAnsi="Calibri" w:eastAsia="Calibri"/>
+          <w:b w:val="0"/>
+          <w:i w:val="0"/>
+          <w:color w:val="333333"/>
+          <w:sz w:val="20"/>
+        </w:rPr>
+        <w:t>Balanced judgment across the above — what is solid vs what needs improvement.</w:t>
+      </w:r>
+    </w:p>
+    <w:p>
+      <w:pPr>
+        <w:spacing w:after="120"/>
       </w:pPr>
       <w:r>
         <w:rPr>
@@ -430,9 +585,1252 @@
           <w:color w:val="333333"/>
           <w:sz w:val="20"/>
         </w:rPr>
-        <w:t>How to use this draft: For each finding, fill the blank fields. Paste screenshots into the gray placeholder boxes. Duplicate a template block when you find a new bug, strength, or suggestion. Keep severity consistent (Critical / High / Medium / Low).</w:t>
+        <w:t>How findings are organized: Bugs, Strengths, and Suggestions can all belong to any quality dimension. Each entry is tagged with a Quality Dimension so the report clearly shows coverage of functionality, workflow, stability, usability, and performance — not only one area. Strengths are not limited to usability; a stable cancel flow or fast progress UI can also be a strength.</w:t>
       </w:r>
     </w:p>
+    <w:p>
+      <w:pPr>
+        <w:spacing w:before="200" w:after="120"/>
+      </w:pPr>
+      <w:r>
+        <w:rPr>
+          <w:rFonts w:ascii="Calibri" w:hAnsi="Calibri" w:eastAsia="Calibri"/>
+          <w:b/>
+          <w:i w:val="0"/>
+          <w:color w:val="2E75B6"/>
+          <w:sz w:val="26"/>
+        </w:rPr>
+        <w:t>1.1 Quality Coverage Matrix (fill while testing)</w:t>
+      </w:r>
+    </w:p>
+    <w:p>
+      <w:pPr>
+        <w:spacing w:after="120"/>
+      </w:pPr>
+      <w:r>
+        <w:rPr>
+          <w:rFonts w:ascii="Calibri" w:hAnsi="Calibri" w:eastAsia="Calibri"/>
+          <w:b w:val="0"/>
+          <w:i w:val="0"/>
+          <w:color w:val="333333"/>
+          <w:sz w:val="20"/>
+        </w:rPr>
+        <w:t>Mark each cell when you have at least one related finding or executed test. Goal: every dimension has evidence (bug and/or strength and/or suggestion and/or test case). This proves balanced SQA thinking.</w:t>
+      </w:r>
+    </w:p>
+    <w:tbl>
+      <w:tblPr>
+        <w:tblStyle w:val="TableGrid"/>
+        <w:tblW w:type="auto" w:w="0"/>
+        <w:jc w:val="center"/>
+        <w:tblLook w:firstColumn="1" w:firstRow="1" w:lastColumn="0" w:lastRow="0" w:noHBand="0" w:noVBand="1" w:val="04A0"/>
+      </w:tblPr>
+      <w:tblGrid>
+        <w:gridCol w:w="1662"/>
+        <w:gridCol w:w="1662"/>
+        <w:gridCol w:w="1662"/>
+        <w:gridCol w:w="1662"/>
+        <w:gridCol w:w="1662"/>
+        <w:gridCol w:w="1662"/>
+      </w:tblGrid>
+      <w:tr>
+        <w:tc>
+          <w:tcPr>
+            <w:tcW w:type="dxa" w:w="1662"/>
+            <w:shd w:fill="1F4E79" w:val="clear"/>
+            <w:tcBorders>
+              <w:top w:val="single" w:sz="4" w:color="BFBFBF"/>
+              <w:left w:val="single" w:sz="4" w:color="BFBFBF"/>
+              <w:bottom w:val="single" w:sz="4" w:color="BFBFBF"/>
+              <w:right w:val="single" w:sz="4" w:color="BFBFBF"/>
+            </w:tcBorders>
+          </w:tcPr>
+          <w:p>
+            <w:pPr>
+              <w:spacing w:before="40" w:after="40"/>
+              <w:jc w:val="center"/>
+            </w:pPr>
+            <w:r/>
+            <w:r>
+              <w:rPr>
+                <w:rFonts w:ascii="Calibri" w:hAnsi="Calibri" w:eastAsia="Calibri"/>
+                <w:b/>
+                <w:i w:val="0"/>
+                <w:color w:val="FFFFFF"/>
+                <w:sz w:val="16"/>
+              </w:rPr>
+              <w:t>Quality Dimension</w:t>
+            </w:r>
+          </w:p>
+        </w:tc>
+        <w:tc>
+          <w:tcPr>
+            <w:tcW w:type="dxa" w:w="1662"/>
+            <w:shd w:fill="1F4E79" w:val="clear"/>
+            <w:tcBorders>
+              <w:top w:val="single" w:sz="4" w:color="BFBFBF"/>
+              <w:left w:val="single" w:sz="4" w:color="BFBFBF"/>
+              <w:bottom w:val="single" w:sz="4" w:color="BFBFBF"/>
+              <w:right w:val="single" w:sz="4" w:color="BFBFBF"/>
+            </w:tcBorders>
+          </w:tcPr>
+          <w:p>
+            <w:pPr>
+              <w:spacing w:before="40" w:after="40"/>
+              <w:jc w:val="center"/>
+            </w:pPr>
+            <w:r/>
+            <w:r>
+              <w:rPr>
+                <w:rFonts w:ascii="Calibri" w:hAnsi="Calibri" w:eastAsia="Calibri"/>
+                <w:b/>
+                <w:i w:val="0"/>
+                <w:color w:val="FFFFFF"/>
+                <w:sz w:val="16"/>
+              </w:rPr>
+              <w:t>Bug IDs</w:t>
+            </w:r>
+          </w:p>
+        </w:tc>
+        <w:tc>
+          <w:tcPr>
+            <w:tcW w:type="dxa" w:w="1662"/>
+            <w:shd w:fill="1F4E79" w:val="clear"/>
+            <w:tcBorders>
+              <w:top w:val="single" w:sz="4" w:color="BFBFBF"/>
+              <w:left w:val="single" w:sz="4" w:color="BFBFBF"/>
+              <w:bottom w:val="single" w:sz="4" w:color="BFBFBF"/>
+              <w:right w:val="single" w:sz="4" w:color="BFBFBF"/>
+            </w:tcBorders>
+          </w:tcPr>
+          <w:p>
+            <w:pPr>
+              <w:spacing w:before="40" w:after="40"/>
+              <w:jc w:val="center"/>
+            </w:pPr>
+            <w:r/>
+            <w:r>
+              <w:rPr>
+                <w:rFonts w:ascii="Calibri" w:hAnsi="Calibri" w:eastAsia="Calibri"/>
+                <w:b/>
+                <w:i w:val="0"/>
+                <w:color w:val="FFFFFF"/>
+                <w:sz w:val="16"/>
+              </w:rPr>
+              <w:t>Strength IDs</w:t>
+            </w:r>
+          </w:p>
+        </w:tc>
+        <w:tc>
+          <w:tcPr>
+            <w:tcW w:type="dxa" w:w="1662"/>
+            <w:shd w:fill="1F4E79" w:val="clear"/>
+            <w:tcBorders>
+              <w:top w:val="single" w:sz="4" w:color="BFBFBF"/>
+              <w:left w:val="single" w:sz="4" w:color="BFBFBF"/>
+              <w:bottom w:val="single" w:sz="4" w:color="BFBFBF"/>
+              <w:right w:val="single" w:sz="4" w:color="BFBFBF"/>
+            </w:tcBorders>
+          </w:tcPr>
+          <w:p>
+            <w:pPr>
+              <w:spacing w:before="40" w:after="40"/>
+              <w:jc w:val="center"/>
+            </w:pPr>
+            <w:r/>
+            <w:r>
+              <w:rPr>
+                <w:rFonts w:ascii="Calibri" w:hAnsi="Calibri" w:eastAsia="Calibri"/>
+                <w:b/>
+                <w:i w:val="0"/>
+                <w:color w:val="FFFFFF"/>
+                <w:sz w:val="16"/>
+              </w:rPr>
+              <w:t>Suggestion IDs</w:t>
+            </w:r>
+          </w:p>
+        </w:tc>
+        <w:tc>
+          <w:tcPr>
+            <w:tcW w:type="dxa" w:w="1662"/>
+            <w:shd w:fill="1F4E79" w:val="clear"/>
+            <w:tcBorders>
+              <w:top w:val="single" w:sz="4" w:color="BFBFBF"/>
+              <w:left w:val="single" w:sz="4" w:color="BFBFBF"/>
+              <w:bottom w:val="single" w:sz="4" w:color="BFBFBF"/>
+              <w:right w:val="single" w:sz="4" w:color="BFBFBF"/>
+            </w:tcBorders>
+          </w:tcPr>
+          <w:p>
+            <w:pPr>
+              <w:spacing w:before="40" w:after="40"/>
+              <w:jc w:val="center"/>
+            </w:pPr>
+            <w:r/>
+            <w:r>
+              <w:rPr>
+                <w:rFonts w:ascii="Calibri" w:hAnsi="Calibri" w:eastAsia="Calibri"/>
+                <w:b/>
+                <w:i w:val="0"/>
+                <w:color w:val="FFFFFF"/>
+                <w:sz w:val="16"/>
+              </w:rPr>
+              <w:t>Related Test Cases</w:t>
+            </w:r>
+          </w:p>
+        </w:tc>
+        <w:tc>
+          <w:tcPr>
+            <w:tcW w:type="dxa" w:w="1662"/>
+            <w:shd w:fill="1F4E79" w:val="clear"/>
+            <w:tcBorders>
+              <w:top w:val="single" w:sz="4" w:color="BFBFBF"/>
+              <w:left w:val="single" w:sz="4" w:color="BFBFBF"/>
+              <w:bottom w:val="single" w:sz="4" w:color="BFBFBF"/>
+              <w:right w:val="single" w:sz="4" w:color="BFBFBF"/>
+            </w:tcBorders>
+          </w:tcPr>
+          <w:p>
+            <w:pPr>
+              <w:spacing w:before="40" w:after="40"/>
+              <w:jc w:val="center"/>
+            </w:pPr>
+            <w:r/>
+            <w:r>
+              <w:rPr>
+                <w:rFonts w:ascii="Calibri" w:hAnsi="Calibri" w:eastAsia="Calibri"/>
+                <w:b/>
+                <w:i w:val="0"/>
+                <w:color w:val="FFFFFF"/>
+                <w:sz w:val="16"/>
+              </w:rPr>
+              <w:t>Covered?</w:t>
+            </w:r>
+          </w:p>
+        </w:tc>
+      </w:tr>
+      <w:tr>
+        <w:tc>
+          <w:tcPr>
+            <w:tcW w:type="dxa" w:w="1662"/>
+            <w:shd w:fill="FFFFFF" w:val="clear"/>
+            <w:tcBorders>
+              <w:top w:val="single" w:sz="4" w:color="BFBFBF"/>
+              <w:left w:val="single" w:sz="4" w:color="BFBFBF"/>
+              <w:bottom w:val="single" w:sz="4" w:color="BFBFBF"/>
+              <w:right w:val="single" w:sz="4" w:color="BFBFBF"/>
+            </w:tcBorders>
+          </w:tcPr>
+          <w:p>
+            <w:pPr>
+              <w:spacing w:before="40" w:after="40"/>
+            </w:pPr>
+            <w:r/>
+            <w:r>
+              <w:rPr>
+                <w:rFonts w:ascii="Calibri" w:hAnsi="Calibri" w:eastAsia="Calibri"/>
+                <w:b w:val="0"/>
+                <w:i w:val="0"/>
+                <w:color w:val="333333"/>
+                <w:sz w:val="16"/>
+              </w:rPr>
+              <w:t>Functionality</w:t>
+            </w:r>
+          </w:p>
+        </w:tc>
+        <w:tc>
+          <w:tcPr>
+            <w:tcW w:type="dxa" w:w="1662"/>
+            <w:shd w:fill="FFFFFF" w:val="clear"/>
+            <w:tcBorders>
+              <w:top w:val="single" w:sz="4" w:color="BFBFBF"/>
+              <w:left w:val="single" w:sz="4" w:color="BFBFBF"/>
+              <w:bottom w:val="single" w:sz="4" w:color="BFBFBF"/>
+              <w:right w:val="single" w:sz="4" w:color="BFBFBF"/>
+            </w:tcBorders>
+          </w:tcPr>
+          <w:p>
+            <w:pPr>
+              <w:spacing w:before="40" w:after="40"/>
+            </w:pPr>
+            <w:r/>
+            <w:r>
+              <w:rPr>
+                <w:rFonts w:ascii="Calibri" w:hAnsi="Calibri" w:eastAsia="Calibri"/>
+                <w:b w:val="0"/>
+                <w:i w:val="0"/>
+                <w:color w:val="333333"/>
+                <w:sz w:val="16"/>
+              </w:rPr>
+              <w:t>[ ]</w:t>
+            </w:r>
+          </w:p>
+        </w:tc>
+        <w:tc>
+          <w:tcPr>
+            <w:tcW w:type="dxa" w:w="1662"/>
+            <w:shd w:fill="FFFFFF" w:val="clear"/>
+            <w:tcBorders>
+              <w:top w:val="single" w:sz="4" w:color="BFBFBF"/>
+              <w:left w:val="single" w:sz="4" w:color="BFBFBF"/>
+              <w:bottom w:val="single" w:sz="4" w:color="BFBFBF"/>
+              <w:right w:val="single" w:sz="4" w:color="BFBFBF"/>
+            </w:tcBorders>
+          </w:tcPr>
+          <w:p>
+            <w:pPr>
+              <w:spacing w:before="40" w:after="40"/>
+            </w:pPr>
+            <w:r/>
+            <w:r>
+              <w:rPr>
+                <w:rFonts w:ascii="Calibri" w:hAnsi="Calibri" w:eastAsia="Calibri"/>
+                <w:b w:val="0"/>
+                <w:i w:val="0"/>
+                <w:color w:val="333333"/>
+                <w:sz w:val="16"/>
+              </w:rPr>
+              <w:t>[ ]</w:t>
+            </w:r>
+          </w:p>
+        </w:tc>
+        <w:tc>
+          <w:tcPr>
+            <w:tcW w:type="dxa" w:w="1662"/>
+            <w:shd w:fill="FFFFFF" w:val="clear"/>
+            <w:tcBorders>
+              <w:top w:val="single" w:sz="4" w:color="BFBFBF"/>
+              <w:left w:val="single" w:sz="4" w:color="BFBFBF"/>
+              <w:bottom w:val="single" w:sz="4" w:color="BFBFBF"/>
+              <w:right w:val="single" w:sz="4" w:color="BFBFBF"/>
+            </w:tcBorders>
+          </w:tcPr>
+          <w:p>
+            <w:pPr>
+              <w:spacing w:before="40" w:after="40"/>
+            </w:pPr>
+            <w:r/>
+            <w:r>
+              <w:rPr>
+                <w:rFonts w:ascii="Calibri" w:hAnsi="Calibri" w:eastAsia="Calibri"/>
+                <w:b w:val="0"/>
+                <w:i w:val="0"/>
+                <w:color w:val="333333"/>
+                <w:sz w:val="16"/>
+              </w:rPr>
+              <w:t>[ ]</w:t>
+            </w:r>
+          </w:p>
+        </w:tc>
+        <w:tc>
+          <w:tcPr>
+            <w:tcW w:type="dxa" w:w="1662"/>
+            <w:shd w:fill="FFFFFF" w:val="clear"/>
+            <w:tcBorders>
+              <w:top w:val="single" w:sz="4" w:color="BFBFBF"/>
+              <w:left w:val="single" w:sz="4" w:color="BFBFBF"/>
+              <w:bottom w:val="single" w:sz="4" w:color="BFBFBF"/>
+              <w:right w:val="single" w:sz="4" w:color="BFBFBF"/>
+            </w:tcBorders>
+          </w:tcPr>
+          <w:p>
+            <w:pPr>
+              <w:spacing w:before="40" w:after="40"/>
+            </w:pPr>
+            <w:r/>
+            <w:r>
+              <w:rPr>
+                <w:rFonts w:ascii="Calibri" w:hAnsi="Calibri" w:eastAsia="Calibri"/>
+                <w:b w:val="0"/>
+                <w:i w:val="0"/>
+                <w:color w:val="333333"/>
+                <w:sz w:val="16"/>
+              </w:rPr>
+              <w:t>TC-BR-*, TC-BT-*</w:t>
+            </w:r>
+          </w:p>
+        </w:tc>
+        <w:tc>
+          <w:tcPr>
+            <w:tcW w:type="dxa" w:w="1662"/>
+            <w:shd w:fill="FFFFFF" w:val="clear"/>
+            <w:tcBorders>
+              <w:top w:val="single" w:sz="4" w:color="BFBFBF"/>
+              <w:left w:val="single" w:sz="4" w:color="BFBFBF"/>
+              <w:bottom w:val="single" w:sz="4" w:color="BFBFBF"/>
+              <w:right w:val="single" w:sz="4" w:color="BFBFBF"/>
+            </w:tcBorders>
+          </w:tcPr>
+          <w:p>
+            <w:pPr>
+              <w:spacing w:before="40" w:after="40"/>
+            </w:pPr>
+            <w:r/>
+            <w:r>
+              <w:rPr>
+                <w:rFonts w:ascii="Calibri" w:hAnsi="Calibri" w:eastAsia="Calibri"/>
+                <w:b w:val="0"/>
+                <w:i w:val="0"/>
+                <w:color w:val="333333"/>
+                <w:sz w:val="16"/>
+              </w:rPr>
+              <w:t>[ ]</w:t>
+            </w:r>
+          </w:p>
+        </w:tc>
+      </w:tr>
+      <w:tr>
+        <w:tc>
+          <w:tcPr>
+            <w:tcW w:type="dxa" w:w="1662"/>
+            <w:shd w:fill="F2F2F2" w:val="clear"/>
+            <w:tcBorders>
+              <w:top w:val="single" w:sz="4" w:color="BFBFBF"/>
+              <w:left w:val="single" w:sz="4" w:color="BFBFBF"/>
+              <w:bottom w:val="single" w:sz="4" w:color="BFBFBF"/>
+              <w:right w:val="single" w:sz="4" w:color="BFBFBF"/>
+            </w:tcBorders>
+          </w:tcPr>
+          <w:p>
+            <w:pPr>
+              <w:spacing w:before="40" w:after="40"/>
+            </w:pPr>
+            <w:r/>
+            <w:r>
+              <w:rPr>
+                <w:rFonts w:ascii="Calibri" w:hAnsi="Calibri" w:eastAsia="Calibri"/>
+                <w:b w:val="0"/>
+                <w:i w:val="0"/>
+                <w:color w:val="333333"/>
+                <w:sz w:val="16"/>
+              </w:rPr>
+              <w:t>Workflow</w:t>
+            </w:r>
+          </w:p>
+        </w:tc>
+        <w:tc>
+          <w:tcPr>
+            <w:tcW w:type="dxa" w:w="1662"/>
+            <w:shd w:fill="F2F2F2" w:val="clear"/>
+            <w:tcBorders>
+              <w:top w:val="single" w:sz="4" w:color="BFBFBF"/>
+              <w:left w:val="single" w:sz="4" w:color="BFBFBF"/>
+              <w:bottom w:val="single" w:sz="4" w:color="BFBFBF"/>
+              <w:right w:val="single" w:sz="4" w:color="BFBFBF"/>
+            </w:tcBorders>
+          </w:tcPr>
+          <w:p>
+            <w:pPr>
+              <w:spacing w:before="40" w:after="40"/>
+            </w:pPr>
+            <w:r/>
+            <w:r>
+              <w:rPr>
+                <w:rFonts w:ascii="Calibri" w:hAnsi="Calibri" w:eastAsia="Calibri"/>
+                <w:b w:val="0"/>
+                <w:i w:val="0"/>
+                <w:color w:val="333333"/>
+                <w:sz w:val="16"/>
+              </w:rPr>
+              <w:t>[ ]</w:t>
+            </w:r>
+          </w:p>
+        </w:tc>
+        <w:tc>
+          <w:tcPr>
+            <w:tcW w:type="dxa" w:w="1662"/>
+            <w:shd w:fill="F2F2F2" w:val="clear"/>
+            <w:tcBorders>
+              <w:top w:val="single" w:sz="4" w:color="BFBFBF"/>
+              <w:left w:val="single" w:sz="4" w:color="BFBFBF"/>
+              <w:bottom w:val="single" w:sz="4" w:color="BFBFBF"/>
+              <w:right w:val="single" w:sz="4" w:color="BFBFBF"/>
+            </w:tcBorders>
+          </w:tcPr>
+          <w:p>
+            <w:pPr>
+              <w:spacing w:before="40" w:after="40"/>
+            </w:pPr>
+            <w:r/>
+            <w:r>
+              <w:rPr>
+                <w:rFonts w:ascii="Calibri" w:hAnsi="Calibri" w:eastAsia="Calibri"/>
+                <w:b w:val="0"/>
+                <w:i w:val="0"/>
+                <w:color w:val="333333"/>
+                <w:sz w:val="16"/>
+              </w:rPr>
+              <w:t>[ ]</w:t>
+            </w:r>
+          </w:p>
+        </w:tc>
+        <w:tc>
+          <w:tcPr>
+            <w:tcW w:type="dxa" w:w="1662"/>
+            <w:shd w:fill="F2F2F2" w:val="clear"/>
+            <w:tcBorders>
+              <w:top w:val="single" w:sz="4" w:color="BFBFBF"/>
+              <w:left w:val="single" w:sz="4" w:color="BFBFBF"/>
+              <w:bottom w:val="single" w:sz="4" w:color="BFBFBF"/>
+              <w:right w:val="single" w:sz="4" w:color="BFBFBF"/>
+            </w:tcBorders>
+          </w:tcPr>
+          <w:p>
+            <w:pPr>
+              <w:spacing w:before="40" w:after="40"/>
+            </w:pPr>
+            <w:r/>
+            <w:r>
+              <w:rPr>
+                <w:rFonts w:ascii="Calibri" w:hAnsi="Calibri" w:eastAsia="Calibri"/>
+                <w:b w:val="0"/>
+                <w:i w:val="0"/>
+                <w:color w:val="333333"/>
+                <w:sz w:val="16"/>
+              </w:rPr>
+              <w:t>[ ]</w:t>
+            </w:r>
+          </w:p>
+        </w:tc>
+        <w:tc>
+          <w:tcPr>
+            <w:tcW w:type="dxa" w:w="1662"/>
+            <w:shd w:fill="F2F2F2" w:val="clear"/>
+            <w:tcBorders>
+              <w:top w:val="single" w:sz="4" w:color="BFBFBF"/>
+              <w:left w:val="single" w:sz="4" w:color="BFBFBF"/>
+              <w:bottom w:val="single" w:sz="4" w:color="BFBFBF"/>
+              <w:right w:val="single" w:sz="4" w:color="BFBFBF"/>
+            </w:tcBorders>
+          </w:tcPr>
+          <w:p>
+            <w:pPr>
+              <w:spacing w:before="40" w:after="40"/>
+            </w:pPr>
+            <w:r/>
+            <w:r>
+              <w:rPr>
+                <w:rFonts w:ascii="Calibri" w:hAnsi="Calibri" w:eastAsia="Calibri"/>
+                <w:b w:val="0"/>
+                <w:i w:val="0"/>
+                <w:color w:val="333333"/>
+                <w:sz w:val="16"/>
+              </w:rPr>
+              <w:t>TC-BR-001..009, TC-BT-001..011</w:t>
+            </w:r>
+          </w:p>
+        </w:tc>
+        <w:tc>
+          <w:tcPr>
+            <w:tcW w:type="dxa" w:w="1662"/>
+            <w:shd w:fill="F2F2F2" w:val="clear"/>
+            <w:tcBorders>
+              <w:top w:val="single" w:sz="4" w:color="BFBFBF"/>
+              <w:left w:val="single" w:sz="4" w:color="BFBFBF"/>
+              <w:bottom w:val="single" w:sz="4" w:color="BFBFBF"/>
+              <w:right w:val="single" w:sz="4" w:color="BFBFBF"/>
+            </w:tcBorders>
+          </w:tcPr>
+          <w:p>
+            <w:pPr>
+              <w:spacing w:before="40" w:after="40"/>
+            </w:pPr>
+            <w:r/>
+            <w:r>
+              <w:rPr>
+                <w:rFonts w:ascii="Calibri" w:hAnsi="Calibri" w:eastAsia="Calibri"/>
+                <w:b w:val="0"/>
+                <w:i w:val="0"/>
+                <w:color w:val="333333"/>
+                <w:sz w:val="16"/>
+              </w:rPr>
+              <w:t>[ ]</w:t>
+            </w:r>
+          </w:p>
+        </w:tc>
+      </w:tr>
+      <w:tr>
+        <w:tc>
+          <w:tcPr>
+            <w:tcW w:type="dxa" w:w="1662"/>
+            <w:shd w:fill="FFFFFF" w:val="clear"/>
+            <w:tcBorders>
+              <w:top w:val="single" w:sz="4" w:color="BFBFBF"/>
+              <w:left w:val="single" w:sz="4" w:color="BFBFBF"/>
+              <w:bottom w:val="single" w:sz="4" w:color="BFBFBF"/>
+              <w:right w:val="single" w:sz="4" w:color="BFBFBF"/>
+            </w:tcBorders>
+          </w:tcPr>
+          <w:p>
+            <w:pPr>
+              <w:spacing w:before="40" w:after="40"/>
+            </w:pPr>
+            <w:r/>
+            <w:r>
+              <w:rPr>
+                <w:rFonts w:ascii="Calibri" w:hAnsi="Calibri" w:eastAsia="Calibri"/>
+                <w:b w:val="0"/>
+                <w:i w:val="0"/>
+                <w:color w:val="333333"/>
+                <w:sz w:val="16"/>
+              </w:rPr>
+              <w:t>Stability</w:t>
+            </w:r>
+          </w:p>
+        </w:tc>
+        <w:tc>
+          <w:tcPr>
+            <w:tcW w:type="dxa" w:w="1662"/>
+            <w:shd w:fill="FFFFFF" w:val="clear"/>
+            <w:tcBorders>
+              <w:top w:val="single" w:sz="4" w:color="BFBFBF"/>
+              <w:left w:val="single" w:sz="4" w:color="BFBFBF"/>
+              <w:bottom w:val="single" w:sz="4" w:color="BFBFBF"/>
+              <w:right w:val="single" w:sz="4" w:color="BFBFBF"/>
+            </w:tcBorders>
+          </w:tcPr>
+          <w:p>
+            <w:pPr>
+              <w:spacing w:before="40" w:after="40"/>
+            </w:pPr>
+            <w:r/>
+            <w:r>
+              <w:rPr>
+                <w:rFonts w:ascii="Calibri" w:hAnsi="Calibri" w:eastAsia="Calibri"/>
+                <w:b w:val="0"/>
+                <w:i w:val="0"/>
+                <w:color w:val="333333"/>
+                <w:sz w:val="16"/>
+              </w:rPr>
+              <w:t>[ ]</w:t>
+            </w:r>
+          </w:p>
+        </w:tc>
+        <w:tc>
+          <w:tcPr>
+            <w:tcW w:type="dxa" w:w="1662"/>
+            <w:shd w:fill="FFFFFF" w:val="clear"/>
+            <w:tcBorders>
+              <w:top w:val="single" w:sz="4" w:color="BFBFBF"/>
+              <w:left w:val="single" w:sz="4" w:color="BFBFBF"/>
+              <w:bottom w:val="single" w:sz="4" w:color="BFBFBF"/>
+              <w:right w:val="single" w:sz="4" w:color="BFBFBF"/>
+            </w:tcBorders>
+          </w:tcPr>
+          <w:p>
+            <w:pPr>
+              <w:spacing w:before="40" w:after="40"/>
+            </w:pPr>
+            <w:r/>
+            <w:r>
+              <w:rPr>
+                <w:rFonts w:ascii="Calibri" w:hAnsi="Calibri" w:eastAsia="Calibri"/>
+                <w:b w:val="0"/>
+                <w:i w:val="0"/>
+                <w:color w:val="333333"/>
+                <w:sz w:val="16"/>
+              </w:rPr>
+              <w:t>[ ]</w:t>
+            </w:r>
+          </w:p>
+        </w:tc>
+        <w:tc>
+          <w:tcPr>
+            <w:tcW w:type="dxa" w:w="1662"/>
+            <w:shd w:fill="FFFFFF" w:val="clear"/>
+            <w:tcBorders>
+              <w:top w:val="single" w:sz="4" w:color="BFBFBF"/>
+              <w:left w:val="single" w:sz="4" w:color="BFBFBF"/>
+              <w:bottom w:val="single" w:sz="4" w:color="BFBFBF"/>
+              <w:right w:val="single" w:sz="4" w:color="BFBFBF"/>
+            </w:tcBorders>
+          </w:tcPr>
+          <w:p>
+            <w:pPr>
+              <w:spacing w:before="40" w:after="40"/>
+            </w:pPr>
+            <w:r/>
+            <w:r>
+              <w:rPr>
+                <w:rFonts w:ascii="Calibri" w:hAnsi="Calibri" w:eastAsia="Calibri"/>
+                <w:b w:val="0"/>
+                <w:i w:val="0"/>
+                <w:color w:val="333333"/>
+                <w:sz w:val="16"/>
+              </w:rPr>
+              <w:t>[ ]</w:t>
+            </w:r>
+          </w:p>
+        </w:tc>
+        <w:tc>
+          <w:tcPr>
+            <w:tcW w:type="dxa" w:w="1662"/>
+            <w:shd w:fill="FFFFFF" w:val="clear"/>
+            <w:tcBorders>
+              <w:top w:val="single" w:sz="4" w:color="BFBFBF"/>
+              <w:left w:val="single" w:sz="4" w:color="BFBFBF"/>
+              <w:bottom w:val="single" w:sz="4" w:color="BFBFBF"/>
+              <w:right w:val="single" w:sz="4" w:color="BFBFBF"/>
+            </w:tcBorders>
+          </w:tcPr>
+          <w:p>
+            <w:pPr>
+              <w:spacing w:before="40" w:after="40"/>
+            </w:pPr>
+            <w:r/>
+            <w:r>
+              <w:rPr>
+                <w:rFonts w:ascii="Calibri" w:hAnsi="Calibri" w:eastAsia="Calibri"/>
+                <w:b w:val="0"/>
+                <w:i w:val="0"/>
+                <w:color w:val="333333"/>
+                <w:sz w:val="16"/>
+              </w:rPr>
+              <w:t>TC-BR-006, TC-BT-008, TC-UX-005</w:t>
+            </w:r>
+          </w:p>
+        </w:tc>
+        <w:tc>
+          <w:tcPr>
+            <w:tcW w:type="dxa" w:w="1662"/>
+            <w:shd w:fill="FFFFFF" w:val="clear"/>
+            <w:tcBorders>
+              <w:top w:val="single" w:sz="4" w:color="BFBFBF"/>
+              <w:left w:val="single" w:sz="4" w:color="BFBFBF"/>
+              <w:bottom w:val="single" w:sz="4" w:color="BFBFBF"/>
+              <w:right w:val="single" w:sz="4" w:color="BFBFBF"/>
+            </w:tcBorders>
+          </w:tcPr>
+          <w:p>
+            <w:pPr>
+              <w:spacing w:before="40" w:after="40"/>
+            </w:pPr>
+            <w:r/>
+            <w:r>
+              <w:rPr>
+                <w:rFonts w:ascii="Calibri" w:hAnsi="Calibri" w:eastAsia="Calibri"/>
+                <w:b w:val="0"/>
+                <w:i w:val="0"/>
+                <w:color w:val="333333"/>
+                <w:sz w:val="16"/>
+              </w:rPr>
+              <w:t>[ ]</w:t>
+            </w:r>
+          </w:p>
+        </w:tc>
+      </w:tr>
+      <w:tr>
+        <w:tc>
+          <w:tcPr>
+            <w:tcW w:type="dxa" w:w="1662"/>
+            <w:shd w:fill="F2F2F2" w:val="clear"/>
+            <w:tcBorders>
+              <w:top w:val="single" w:sz="4" w:color="BFBFBF"/>
+              <w:left w:val="single" w:sz="4" w:color="BFBFBF"/>
+              <w:bottom w:val="single" w:sz="4" w:color="BFBFBF"/>
+              <w:right w:val="single" w:sz="4" w:color="BFBFBF"/>
+            </w:tcBorders>
+          </w:tcPr>
+          <w:p>
+            <w:pPr>
+              <w:spacing w:before="40" w:after="40"/>
+            </w:pPr>
+            <w:r/>
+            <w:r>
+              <w:rPr>
+                <w:rFonts w:ascii="Calibri" w:hAnsi="Calibri" w:eastAsia="Calibri"/>
+                <w:b w:val="0"/>
+                <w:i w:val="0"/>
+                <w:color w:val="333333"/>
+                <w:sz w:val="16"/>
+              </w:rPr>
+              <w:t>Usability</w:t>
+            </w:r>
+          </w:p>
+        </w:tc>
+        <w:tc>
+          <w:tcPr>
+            <w:tcW w:type="dxa" w:w="1662"/>
+            <w:shd w:fill="F2F2F2" w:val="clear"/>
+            <w:tcBorders>
+              <w:top w:val="single" w:sz="4" w:color="BFBFBF"/>
+              <w:left w:val="single" w:sz="4" w:color="BFBFBF"/>
+              <w:bottom w:val="single" w:sz="4" w:color="BFBFBF"/>
+              <w:right w:val="single" w:sz="4" w:color="BFBFBF"/>
+            </w:tcBorders>
+          </w:tcPr>
+          <w:p>
+            <w:pPr>
+              <w:spacing w:before="40" w:after="40"/>
+            </w:pPr>
+            <w:r/>
+            <w:r>
+              <w:rPr>
+                <w:rFonts w:ascii="Calibri" w:hAnsi="Calibri" w:eastAsia="Calibri"/>
+                <w:b w:val="0"/>
+                <w:i w:val="0"/>
+                <w:color w:val="333333"/>
+                <w:sz w:val="16"/>
+              </w:rPr>
+              <w:t>[ ]</w:t>
+            </w:r>
+          </w:p>
+        </w:tc>
+        <w:tc>
+          <w:tcPr>
+            <w:tcW w:type="dxa" w:w="1662"/>
+            <w:shd w:fill="F2F2F2" w:val="clear"/>
+            <w:tcBorders>
+              <w:top w:val="single" w:sz="4" w:color="BFBFBF"/>
+              <w:left w:val="single" w:sz="4" w:color="BFBFBF"/>
+              <w:bottom w:val="single" w:sz="4" w:color="BFBFBF"/>
+              <w:right w:val="single" w:sz="4" w:color="BFBFBF"/>
+            </w:tcBorders>
+          </w:tcPr>
+          <w:p>
+            <w:pPr>
+              <w:spacing w:before="40" w:after="40"/>
+            </w:pPr>
+            <w:r/>
+            <w:r>
+              <w:rPr>
+                <w:rFonts w:ascii="Calibri" w:hAnsi="Calibri" w:eastAsia="Calibri"/>
+                <w:b w:val="0"/>
+                <w:i w:val="0"/>
+                <w:color w:val="333333"/>
+                <w:sz w:val="16"/>
+              </w:rPr>
+              <w:t>[ ]</w:t>
+            </w:r>
+          </w:p>
+        </w:tc>
+        <w:tc>
+          <w:tcPr>
+            <w:tcW w:type="dxa" w:w="1662"/>
+            <w:shd w:fill="F2F2F2" w:val="clear"/>
+            <w:tcBorders>
+              <w:top w:val="single" w:sz="4" w:color="BFBFBF"/>
+              <w:left w:val="single" w:sz="4" w:color="BFBFBF"/>
+              <w:bottom w:val="single" w:sz="4" w:color="BFBFBF"/>
+              <w:right w:val="single" w:sz="4" w:color="BFBFBF"/>
+            </w:tcBorders>
+          </w:tcPr>
+          <w:p>
+            <w:pPr>
+              <w:spacing w:before="40" w:after="40"/>
+            </w:pPr>
+            <w:r/>
+            <w:r>
+              <w:rPr>
+                <w:rFonts w:ascii="Calibri" w:hAnsi="Calibri" w:eastAsia="Calibri"/>
+                <w:b w:val="0"/>
+                <w:i w:val="0"/>
+                <w:color w:val="333333"/>
+                <w:sz w:val="16"/>
+              </w:rPr>
+              <w:t>[ ]</w:t>
+            </w:r>
+          </w:p>
+        </w:tc>
+        <w:tc>
+          <w:tcPr>
+            <w:tcW w:type="dxa" w:w="1662"/>
+            <w:shd w:fill="F2F2F2" w:val="clear"/>
+            <w:tcBorders>
+              <w:top w:val="single" w:sz="4" w:color="BFBFBF"/>
+              <w:left w:val="single" w:sz="4" w:color="BFBFBF"/>
+              <w:bottom w:val="single" w:sz="4" w:color="BFBFBF"/>
+              <w:right w:val="single" w:sz="4" w:color="BFBFBF"/>
+            </w:tcBorders>
+          </w:tcPr>
+          <w:p>
+            <w:pPr>
+              <w:spacing w:before="40" w:after="40"/>
+            </w:pPr>
+            <w:r/>
+            <w:r>
+              <w:rPr>
+                <w:rFonts w:ascii="Calibri" w:hAnsi="Calibri" w:eastAsia="Calibri"/>
+                <w:b w:val="0"/>
+                <w:i w:val="0"/>
+                <w:color w:val="333333"/>
+                <w:sz w:val="16"/>
+              </w:rPr>
+              <w:t>TC-UX-001..006</w:t>
+            </w:r>
+          </w:p>
+        </w:tc>
+        <w:tc>
+          <w:tcPr>
+            <w:tcW w:type="dxa" w:w="1662"/>
+            <w:shd w:fill="F2F2F2" w:val="clear"/>
+            <w:tcBorders>
+              <w:top w:val="single" w:sz="4" w:color="BFBFBF"/>
+              <w:left w:val="single" w:sz="4" w:color="BFBFBF"/>
+              <w:bottom w:val="single" w:sz="4" w:color="BFBFBF"/>
+              <w:right w:val="single" w:sz="4" w:color="BFBFBF"/>
+            </w:tcBorders>
+          </w:tcPr>
+          <w:p>
+            <w:pPr>
+              <w:spacing w:before="40" w:after="40"/>
+            </w:pPr>
+            <w:r/>
+            <w:r>
+              <w:rPr>
+                <w:rFonts w:ascii="Calibri" w:hAnsi="Calibri" w:eastAsia="Calibri"/>
+                <w:b w:val="0"/>
+                <w:i w:val="0"/>
+                <w:color w:val="333333"/>
+                <w:sz w:val="16"/>
+              </w:rPr>
+              <w:t>[ ]</w:t>
+            </w:r>
+          </w:p>
+        </w:tc>
+      </w:tr>
+      <w:tr>
+        <w:tc>
+          <w:tcPr>
+            <w:tcW w:type="dxa" w:w="1662"/>
+            <w:shd w:fill="FFFFFF" w:val="clear"/>
+            <w:tcBorders>
+              <w:top w:val="single" w:sz="4" w:color="BFBFBF"/>
+              <w:left w:val="single" w:sz="4" w:color="BFBFBF"/>
+              <w:bottom w:val="single" w:sz="4" w:color="BFBFBF"/>
+              <w:right w:val="single" w:sz="4" w:color="BFBFBF"/>
+            </w:tcBorders>
+          </w:tcPr>
+          <w:p>
+            <w:pPr>
+              <w:spacing w:before="40" w:after="40"/>
+            </w:pPr>
+            <w:r/>
+            <w:r>
+              <w:rPr>
+                <w:rFonts w:ascii="Calibri" w:hAnsi="Calibri" w:eastAsia="Calibri"/>
+                <w:b w:val="0"/>
+                <w:i w:val="0"/>
+                <w:color w:val="333333"/>
+                <w:sz w:val="16"/>
+              </w:rPr>
+              <w:t>Performance</w:t>
+            </w:r>
+          </w:p>
+        </w:tc>
+        <w:tc>
+          <w:tcPr>
+            <w:tcW w:type="dxa" w:w="1662"/>
+            <w:shd w:fill="FFFFFF" w:val="clear"/>
+            <w:tcBorders>
+              <w:top w:val="single" w:sz="4" w:color="BFBFBF"/>
+              <w:left w:val="single" w:sz="4" w:color="BFBFBF"/>
+              <w:bottom w:val="single" w:sz="4" w:color="BFBFBF"/>
+              <w:right w:val="single" w:sz="4" w:color="BFBFBF"/>
+            </w:tcBorders>
+          </w:tcPr>
+          <w:p>
+            <w:pPr>
+              <w:spacing w:before="40" w:after="40"/>
+            </w:pPr>
+            <w:r/>
+            <w:r>
+              <w:rPr>
+                <w:rFonts w:ascii="Calibri" w:hAnsi="Calibri" w:eastAsia="Calibri"/>
+                <w:b w:val="0"/>
+                <w:i w:val="0"/>
+                <w:color w:val="333333"/>
+                <w:sz w:val="16"/>
+              </w:rPr>
+              <w:t>[ ]</w:t>
+            </w:r>
+          </w:p>
+        </w:tc>
+        <w:tc>
+          <w:tcPr>
+            <w:tcW w:type="dxa" w:w="1662"/>
+            <w:shd w:fill="FFFFFF" w:val="clear"/>
+            <w:tcBorders>
+              <w:top w:val="single" w:sz="4" w:color="BFBFBF"/>
+              <w:left w:val="single" w:sz="4" w:color="BFBFBF"/>
+              <w:bottom w:val="single" w:sz="4" w:color="BFBFBF"/>
+              <w:right w:val="single" w:sz="4" w:color="BFBFBF"/>
+            </w:tcBorders>
+          </w:tcPr>
+          <w:p>
+            <w:pPr>
+              <w:spacing w:before="40" w:after="40"/>
+            </w:pPr>
+            <w:r/>
+            <w:r>
+              <w:rPr>
+                <w:rFonts w:ascii="Calibri" w:hAnsi="Calibri" w:eastAsia="Calibri"/>
+                <w:b w:val="0"/>
+                <w:i w:val="0"/>
+                <w:color w:val="333333"/>
+                <w:sz w:val="16"/>
+              </w:rPr>
+              <w:t>[ ]</w:t>
+            </w:r>
+          </w:p>
+        </w:tc>
+        <w:tc>
+          <w:tcPr>
+            <w:tcW w:type="dxa" w:w="1662"/>
+            <w:shd w:fill="FFFFFF" w:val="clear"/>
+            <w:tcBorders>
+              <w:top w:val="single" w:sz="4" w:color="BFBFBF"/>
+              <w:left w:val="single" w:sz="4" w:color="BFBFBF"/>
+              <w:bottom w:val="single" w:sz="4" w:color="BFBFBF"/>
+              <w:right w:val="single" w:sz="4" w:color="BFBFBF"/>
+            </w:tcBorders>
+          </w:tcPr>
+          <w:p>
+            <w:pPr>
+              <w:spacing w:before="40" w:after="40"/>
+            </w:pPr>
+            <w:r/>
+            <w:r>
+              <w:rPr>
+                <w:rFonts w:ascii="Calibri" w:hAnsi="Calibri" w:eastAsia="Calibri"/>
+                <w:b w:val="0"/>
+                <w:i w:val="0"/>
+                <w:color w:val="333333"/>
+                <w:sz w:val="16"/>
+              </w:rPr>
+              <w:t>[ ]</w:t>
+            </w:r>
+          </w:p>
+        </w:tc>
+        <w:tc>
+          <w:tcPr>
+            <w:tcW w:type="dxa" w:w="1662"/>
+            <w:shd w:fill="FFFFFF" w:val="clear"/>
+            <w:tcBorders>
+              <w:top w:val="single" w:sz="4" w:color="BFBFBF"/>
+              <w:left w:val="single" w:sz="4" w:color="BFBFBF"/>
+              <w:bottom w:val="single" w:sz="4" w:color="BFBFBF"/>
+              <w:right w:val="single" w:sz="4" w:color="BFBFBF"/>
+            </w:tcBorders>
+          </w:tcPr>
+          <w:p>
+            <w:pPr>
+              <w:spacing w:before="40" w:after="40"/>
+            </w:pPr>
+            <w:r/>
+            <w:r>
+              <w:rPr>
+                <w:rFonts w:ascii="Calibri" w:hAnsi="Calibri" w:eastAsia="Calibri"/>
+                <w:b w:val="0"/>
+                <w:i w:val="0"/>
+                <w:color w:val="333333"/>
+                <w:sz w:val="16"/>
+              </w:rPr>
+              <w:t>TC-BT-012, TC-UX-002, TC-BR-005</w:t>
+            </w:r>
+          </w:p>
+        </w:tc>
+        <w:tc>
+          <w:tcPr>
+            <w:tcW w:type="dxa" w:w="1662"/>
+            <w:shd w:fill="FFFFFF" w:val="clear"/>
+            <w:tcBorders>
+              <w:top w:val="single" w:sz="4" w:color="BFBFBF"/>
+              <w:left w:val="single" w:sz="4" w:color="BFBFBF"/>
+              <w:bottom w:val="single" w:sz="4" w:color="BFBFBF"/>
+              <w:right w:val="single" w:sz="4" w:color="BFBFBF"/>
+            </w:tcBorders>
+          </w:tcPr>
+          <w:p>
+            <w:pPr>
+              <w:spacing w:before="40" w:after="40"/>
+            </w:pPr>
+            <w:r/>
+            <w:r>
+              <w:rPr>
+                <w:rFonts w:ascii="Calibri" w:hAnsi="Calibri" w:eastAsia="Calibri"/>
+                <w:b w:val="0"/>
+                <w:i w:val="0"/>
+                <w:color w:val="333333"/>
+                <w:sz w:val="16"/>
+              </w:rPr>
+              <w:t>[ ]</w:t>
+            </w:r>
+          </w:p>
+        </w:tc>
+      </w:tr>
+      <w:tr>
+        <w:tc>
+          <w:tcPr>
+            <w:tcW w:type="dxa" w:w="1662"/>
+            <w:shd w:fill="F2F2F2" w:val="clear"/>
+            <w:tcBorders>
+              <w:top w:val="single" w:sz="4" w:color="BFBFBF"/>
+              <w:left w:val="single" w:sz="4" w:color="BFBFBF"/>
+              <w:bottom w:val="single" w:sz="4" w:color="BFBFBF"/>
+              <w:right w:val="single" w:sz="4" w:color="BFBFBF"/>
+            </w:tcBorders>
+          </w:tcPr>
+          <w:p>
+            <w:pPr>
+              <w:spacing w:before="40" w:after="40"/>
+            </w:pPr>
+            <w:r/>
+            <w:r>
+              <w:rPr>
+                <w:rFonts w:ascii="Calibri" w:hAnsi="Calibri" w:eastAsia="Calibri"/>
+                <w:b w:val="0"/>
+                <w:i w:val="0"/>
+                <w:color w:val="333333"/>
+                <w:sz w:val="16"/>
+              </w:rPr>
+              <w:t>Overall Product Quality</w:t>
+            </w:r>
+          </w:p>
+        </w:tc>
+        <w:tc>
+          <w:tcPr>
+            <w:tcW w:type="dxa" w:w="1662"/>
+            <w:shd w:fill="F2F2F2" w:val="clear"/>
+            <w:tcBorders>
+              <w:top w:val="single" w:sz="4" w:color="BFBFBF"/>
+              <w:left w:val="single" w:sz="4" w:color="BFBFBF"/>
+              <w:bottom w:val="single" w:sz="4" w:color="BFBFBF"/>
+              <w:right w:val="single" w:sz="4" w:color="BFBFBF"/>
+            </w:tcBorders>
+          </w:tcPr>
+          <w:p>
+            <w:pPr>
+              <w:spacing w:before="40" w:after="40"/>
+            </w:pPr>
+            <w:r/>
+            <w:r>
+              <w:rPr>
+                <w:rFonts w:ascii="Calibri" w:hAnsi="Calibri" w:eastAsia="Calibri"/>
+                <w:b w:val="0"/>
+                <w:i w:val="0"/>
+                <w:color w:val="333333"/>
+                <w:sz w:val="16"/>
+              </w:rPr>
+              <w:t>—</w:t>
+            </w:r>
+          </w:p>
+        </w:tc>
+        <w:tc>
+          <w:tcPr>
+            <w:tcW w:type="dxa" w:w="1662"/>
+            <w:shd w:fill="F2F2F2" w:val="clear"/>
+            <w:tcBorders>
+              <w:top w:val="single" w:sz="4" w:color="BFBFBF"/>
+              <w:left w:val="single" w:sz="4" w:color="BFBFBF"/>
+              <w:bottom w:val="single" w:sz="4" w:color="BFBFBF"/>
+              <w:right w:val="single" w:sz="4" w:color="BFBFBF"/>
+            </w:tcBorders>
+          </w:tcPr>
+          <w:p>
+            <w:pPr>
+              <w:spacing w:before="40" w:after="40"/>
+            </w:pPr>
+            <w:r/>
+            <w:r>
+              <w:rPr>
+                <w:rFonts w:ascii="Calibri" w:hAnsi="Calibri" w:eastAsia="Calibri"/>
+                <w:b w:val="0"/>
+                <w:i w:val="0"/>
+                <w:color w:val="333333"/>
+                <w:sz w:val="16"/>
+              </w:rPr>
+              <w:t>—</w:t>
+            </w:r>
+          </w:p>
+        </w:tc>
+        <w:tc>
+          <w:tcPr>
+            <w:tcW w:type="dxa" w:w="1662"/>
+            <w:shd w:fill="F2F2F2" w:val="clear"/>
+            <w:tcBorders>
+              <w:top w:val="single" w:sz="4" w:color="BFBFBF"/>
+              <w:left w:val="single" w:sz="4" w:color="BFBFBF"/>
+              <w:bottom w:val="single" w:sz="4" w:color="BFBFBF"/>
+              <w:right w:val="single" w:sz="4" w:color="BFBFBF"/>
+            </w:tcBorders>
+          </w:tcPr>
+          <w:p>
+            <w:pPr>
+              <w:spacing w:before="40" w:after="40"/>
+            </w:pPr>
+            <w:r/>
+            <w:r>
+              <w:rPr>
+                <w:rFonts w:ascii="Calibri" w:hAnsi="Calibri" w:eastAsia="Calibri"/>
+                <w:b w:val="0"/>
+                <w:i w:val="0"/>
+                <w:color w:val="333333"/>
+                <w:sz w:val="16"/>
+              </w:rPr>
+              <w:t>—</w:t>
+            </w:r>
+          </w:p>
+        </w:tc>
+        <w:tc>
+          <w:tcPr>
+            <w:tcW w:type="dxa" w:w="1662"/>
+            <w:shd w:fill="F2F2F2" w:val="clear"/>
+            <w:tcBorders>
+              <w:top w:val="single" w:sz="4" w:color="BFBFBF"/>
+              <w:left w:val="single" w:sz="4" w:color="BFBFBF"/>
+              <w:bottom w:val="single" w:sz="4" w:color="BFBFBF"/>
+              <w:right w:val="single" w:sz="4" w:color="BFBFBF"/>
+            </w:tcBorders>
+          </w:tcPr>
+          <w:p>
+            <w:pPr>
+              <w:spacing w:before="40" w:after="40"/>
+            </w:pPr>
+            <w:r/>
+            <w:r>
+              <w:rPr>
+                <w:rFonts w:ascii="Calibri" w:hAnsi="Calibri" w:eastAsia="Calibri"/>
+                <w:b w:val="0"/>
+                <w:i w:val="0"/>
+                <w:color w:val="333333"/>
+                <w:sz w:val="16"/>
+              </w:rPr>
+              <w:t>Summary §6</w:t>
+            </w:r>
+          </w:p>
+        </w:tc>
+        <w:tc>
+          <w:tcPr>
+            <w:tcW w:type="dxa" w:w="1662"/>
+            <w:shd w:fill="F2F2F2" w:val="clear"/>
+            <w:tcBorders>
+              <w:top w:val="single" w:sz="4" w:color="BFBFBF"/>
+              <w:left w:val="single" w:sz="4" w:color="BFBFBF"/>
+              <w:bottom w:val="single" w:sz="4" w:color="BFBFBF"/>
+              <w:right w:val="single" w:sz="4" w:color="BFBFBF"/>
+            </w:tcBorders>
+          </w:tcPr>
+          <w:p>
+            <w:pPr>
+              <w:spacing w:before="40" w:after="40"/>
+            </w:pPr>
+            <w:r/>
+            <w:r>
+              <w:rPr>
+                <w:rFonts w:ascii="Calibri" w:hAnsi="Calibri" w:eastAsia="Calibri"/>
+                <w:b w:val="0"/>
+                <w:i w:val="0"/>
+                <w:color w:val="333333"/>
+                <w:sz w:val="16"/>
+              </w:rPr>
+              <w:t>[ ]</w:t>
+            </w:r>
+          </w:p>
+        </w:tc>
+      </w:tr>
+    </w:tbl>
+    <w:p/>
     <w:p>
       <w:pPr>
         <w:spacing w:before="280" w:after="120"/>
@@ -450,7 +1848,7 @@
     </w:p>
     <w:p>
       <w:pPr>
-        <w:spacing w:after="120" w:before="0"/>
+        <w:spacing w:after="120"/>
       </w:pPr>
       <w:r>
         <w:rPr>
@@ -460,7 +1858,7 @@
           <w:color w:val="333333"/>
           <w:sz w:val="20"/>
         </w:rPr>
-        <w:t>Each bug below follows the required fields: Bug Title, Steps to Reproduce, Expected Result, Actual Result, Severity, and Screenshot / Screen Record. Severity guide: Critical = blocker / crash / data loss; High = major feature broken; Medium = workaround exists; Low = minor / cosmetic.</w:t>
+        <w:t>Required fields: Bug Title, Steps to Reproduce, Expected Result, Actual Result, Severity, Screenshot/Screen Record. Also tag Quality Dimension. Severity: Critical = crash/blocker/data loss; High = major feature broken; Medium = workaround exists; Low = minor/cosmetic.</w:t>
       </w:r>
     </w:p>
     <w:p>
@@ -480,7 +1878,7 @@
     </w:p>
     <w:p>
       <w:pPr>
-        <w:spacing w:after="80" w:before="0"/>
+        <w:spacing w:after="80"/>
       </w:pPr>
       <w:r>
         <w:rPr>
@@ -584,7 +1982,7 @@
                 <w:color w:val="1F4E79"/>
                 <w:sz w:val="18"/>
               </w:rPr>
-              <w:t>Severity</w:t>
+              <w:t>Quality Dimension</w:t>
             </w:r>
           </w:p>
         </w:tc>
@@ -611,7 +2009,7 @@
                 <w:color w:val="666666"/>
                 <w:sz w:val="18"/>
               </w:rPr>
-              <w:t>[ Critical / High / Medium / Low ]</w:t>
+              <w:t>[ Functionality / Workflow / Stability / Usability / Performance ]</w:t>
             </w:r>
           </w:p>
         </w:tc>
@@ -641,7 +2039,7 @@
                 <w:color w:val="1F4E79"/>
                 <w:sz w:val="18"/>
               </w:rPr>
-              <w:t>Environment</w:t>
+              <w:t>Severity</w:t>
             </w:r>
           </w:p>
         </w:tc>
@@ -668,7 +2066,7 @@
                 <w:color w:val="666666"/>
                 <w:sz w:val="18"/>
               </w:rPr>
-              <w:t>[ Device · OS · App version if known ]</w:t>
+              <w:t>[ Critical / High / Medium / Low ]</w:t>
             </w:r>
           </w:p>
         </w:tc>
@@ -698,7 +2096,7 @@
                 <w:color w:val="1F4E79"/>
                 <w:sz w:val="18"/>
               </w:rPr>
-              <w:t>Frequency</w:t>
+              <w:t>Environment</w:t>
             </w:r>
           </w:p>
         </w:tc>
@@ -725,7 +2123,7 @@
                 <w:color w:val="666666"/>
                 <w:sz w:val="18"/>
               </w:rPr>
-              <w:t>[ Always / Sometimes / Once ]</w:t>
+              <w:t>[ Device · OS · App version if known ]</w:t>
             </w:r>
           </w:p>
         </w:tc>
@@ -755,7 +2153,7 @@
                 <w:color w:val="1F4E79"/>
                 <w:sz w:val="18"/>
               </w:rPr>
-              <w:t>Related to</w:t>
+              <w:t>Frequency</w:t>
             </w:r>
           </w:p>
         </w:tc>
@@ -782,7 +2180,64 @@
                 <w:color w:val="666666"/>
                 <w:sz w:val="18"/>
               </w:rPr>
-              <w:t>[ Functionality / Usability / Performance / Stability / UI ]</w:t>
+              <w:t>[ Always / Sometimes / Once ]</w:t>
+            </w:r>
+          </w:p>
+        </w:tc>
+      </w:tr>
+      <w:tr>
+        <w:tc>
+          <w:tcPr>
+            <w:tcW w:type="dxa" w:w="4986"/>
+            <w:shd w:fill="E7E6E6" w:val="clear"/>
+            <w:tcBorders>
+              <w:top w:val="single" w:sz="4" w:color="BFBFBF"/>
+              <w:left w:val="single" w:sz="4" w:color="BFBFBF"/>
+              <w:bottom w:val="single" w:sz="4" w:color="BFBFBF"/>
+              <w:right w:val="single" w:sz="4" w:color="BFBFBF"/>
+            </w:tcBorders>
+          </w:tcPr>
+          <w:p>
+            <w:pPr>
+              <w:spacing w:before="40" w:after="40"/>
+            </w:pPr>
+            <w:r/>
+            <w:r>
+              <w:rPr>
+                <w:rFonts w:ascii="Calibri" w:hAnsi="Calibri" w:eastAsia="Calibri"/>
+                <w:b/>
+                <w:i w:val="0"/>
+                <w:color w:val="1F4E79"/>
+                <w:sz w:val="18"/>
+              </w:rPr>
+              <w:t>Related to</w:t>
+            </w:r>
+          </w:p>
+        </w:tc>
+        <w:tc>
+          <w:tcPr>
+            <w:tcW w:type="dxa" w:w="4986"/>
+            <w:tcBorders>
+              <w:top w:val="single" w:sz="4" w:color="BFBFBF"/>
+              <w:left w:val="single" w:sz="4" w:color="BFBFBF"/>
+              <w:bottom w:val="single" w:sz="4" w:color="BFBFBF"/>
+              <w:right w:val="single" w:sz="4" w:color="BFBFBF"/>
+            </w:tcBorders>
+          </w:tcPr>
+          <w:p>
+            <w:pPr>
+              <w:spacing w:before="40" w:after="40"/>
+            </w:pPr>
+            <w:r/>
+            <w:r>
+              <w:rPr>
+                <w:rFonts w:ascii="Calibri" w:hAnsi="Calibri" w:eastAsia="Calibri"/>
+                <w:b w:val="0"/>
+                <w:i/>
+                <w:color w:val="666666"/>
+                <w:sz w:val="18"/>
+              </w:rPr>
+              <w:t>[ Optional secondary tag ]</w:t>
             </w:r>
           </w:p>
         </w:tc>
@@ -917,7 +2372,7 @@
     </w:p>
     <w:p>
       <w:pPr>
-        <w:spacing w:after="120" w:before="0"/>
+        <w:spacing w:after="120"/>
       </w:pPr>
       <w:r>
         <w:rPr>
@@ -947,7 +2402,7 @@
     </w:p>
     <w:p>
       <w:pPr>
-        <w:spacing w:after="120" w:before="0"/>
+        <w:spacing w:after="120"/>
       </w:pPr>
       <w:r>
         <w:rPr>
@@ -1049,7 +2504,7 @@
     </w:p>
     <w:p>
       <w:pPr>
-        <w:spacing w:after="120" w:before="0"/>
+        <w:spacing w:after="120"/>
       </w:pPr>
       <w:r>
         <w:rPr>
@@ -1079,7 +2534,7 @@
     </w:p>
     <w:p>
       <w:pPr>
-        <w:spacing w:after="80" w:before="0"/>
+        <w:spacing w:after="80"/>
       </w:pPr>
       <w:r>
         <w:rPr>
@@ -1183,7 +2638,7 @@
                 <w:color w:val="1F4E79"/>
                 <w:sz w:val="18"/>
               </w:rPr>
-              <w:t>Severity</w:t>
+              <w:t>Quality Dimension</w:t>
             </w:r>
           </w:p>
         </w:tc>
@@ -1210,7 +2665,7 @@
                 <w:color w:val="666666"/>
                 <w:sz w:val="18"/>
               </w:rPr>
-              <w:t>[ Critical / High / Medium / Low ]</w:t>
+              <w:t>[ Functionality / Workflow / Stability / Usability / Performance ]</w:t>
             </w:r>
           </w:p>
         </w:tc>
@@ -1240,7 +2695,7 @@
                 <w:color w:val="1F4E79"/>
                 <w:sz w:val="18"/>
               </w:rPr>
-              <w:t>Environment</w:t>
+              <w:t>Severity</w:t>
             </w:r>
           </w:p>
         </w:tc>
@@ -1267,7 +2722,7 @@
                 <w:color w:val="666666"/>
                 <w:sz w:val="18"/>
               </w:rPr>
-              <w:t>[ Device · OS · App version if known ]</w:t>
+              <w:t>[ Critical / High / Medium / Low ]</w:t>
             </w:r>
           </w:p>
         </w:tc>
@@ -1297,7 +2752,7 @@
                 <w:color w:val="1F4E79"/>
                 <w:sz w:val="18"/>
               </w:rPr>
-              <w:t>Frequency</w:t>
+              <w:t>Environment</w:t>
             </w:r>
           </w:p>
         </w:tc>
@@ -1324,7 +2779,7 @@
                 <w:color w:val="666666"/>
                 <w:sz w:val="18"/>
               </w:rPr>
-              <w:t>[ Always / Sometimes / Once ]</w:t>
+              <w:t>[ Device · OS · App version if known ]</w:t>
             </w:r>
           </w:p>
         </w:tc>
@@ -1354,7 +2809,7 @@
                 <w:color w:val="1F4E79"/>
                 <w:sz w:val="18"/>
               </w:rPr>
-              <w:t>Related to</w:t>
+              <w:t>Frequency</w:t>
             </w:r>
           </w:p>
         </w:tc>
@@ -1381,7 +2836,64 @@
                 <w:color w:val="666666"/>
                 <w:sz w:val="18"/>
               </w:rPr>
-              <w:t>[ Functionality / Usability / Performance / Stability / UI ]</w:t>
+              <w:t>[ Always / Sometimes / Once ]</w:t>
+            </w:r>
+          </w:p>
+        </w:tc>
+      </w:tr>
+      <w:tr>
+        <w:tc>
+          <w:tcPr>
+            <w:tcW w:type="dxa" w:w="4986"/>
+            <w:shd w:fill="E7E6E6" w:val="clear"/>
+            <w:tcBorders>
+              <w:top w:val="single" w:sz="4" w:color="BFBFBF"/>
+              <w:left w:val="single" w:sz="4" w:color="BFBFBF"/>
+              <w:bottom w:val="single" w:sz="4" w:color="BFBFBF"/>
+              <w:right w:val="single" w:sz="4" w:color="BFBFBF"/>
+            </w:tcBorders>
+          </w:tcPr>
+          <w:p>
+            <w:pPr>
+              <w:spacing w:before="40" w:after="40"/>
+            </w:pPr>
+            <w:r/>
+            <w:r>
+              <w:rPr>
+                <w:rFonts w:ascii="Calibri" w:hAnsi="Calibri" w:eastAsia="Calibri"/>
+                <w:b/>
+                <w:i w:val="0"/>
+                <w:color w:val="1F4E79"/>
+                <w:sz w:val="18"/>
+              </w:rPr>
+              <w:t>Related to</w:t>
+            </w:r>
+          </w:p>
+        </w:tc>
+        <w:tc>
+          <w:tcPr>
+            <w:tcW w:type="dxa" w:w="4986"/>
+            <w:tcBorders>
+              <w:top w:val="single" w:sz="4" w:color="BFBFBF"/>
+              <w:left w:val="single" w:sz="4" w:color="BFBFBF"/>
+              <w:bottom w:val="single" w:sz="4" w:color="BFBFBF"/>
+              <w:right w:val="single" w:sz="4" w:color="BFBFBF"/>
+            </w:tcBorders>
+          </w:tcPr>
+          <w:p>
+            <w:pPr>
+              <w:spacing w:before="40" w:after="40"/>
+            </w:pPr>
+            <w:r/>
+            <w:r>
+              <w:rPr>
+                <w:rFonts w:ascii="Calibri" w:hAnsi="Calibri" w:eastAsia="Calibri"/>
+                <w:b w:val="0"/>
+                <w:i/>
+                <w:color w:val="666666"/>
+                <w:sz w:val="18"/>
+              </w:rPr>
+              <w:t>[ Optional secondary tag ]</w:t>
             </w:r>
           </w:p>
         </w:tc>
@@ -1516,7 +3028,7 @@
     </w:p>
     <w:p>
       <w:pPr>
-        <w:spacing w:after="120" w:before="0"/>
+        <w:spacing w:after="120"/>
       </w:pPr>
       <w:r>
         <w:rPr>
@@ -1546,7 +3058,7 @@
     </w:p>
     <w:p>
       <w:pPr>
-        <w:spacing w:after="120" w:before="0"/>
+        <w:spacing w:after="120"/>
       </w:pPr>
       <w:r>
         <w:rPr>
@@ -1648,7 +3160,7 @@
     </w:p>
     <w:p>
       <w:pPr>
-        <w:spacing w:after="120" w:before="0"/>
+        <w:spacing w:after="120"/>
       </w:pPr>
       <w:r>
         <w:rPr>
@@ -1678,7 +3190,7 @@
     </w:p>
     <w:p>
       <w:pPr>
-        <w:spacing w:after="80" w:before="0"/>
+        <w:spacing w:after="80"/>
       </w:pPr>
       <w:r>
         <w:rPr>
@@ -1782,7 +3294,7 @@
                 <w:color w:val="1F4E79"/>
                 <w:sz w:val="18"/>
               </w:rPr>
-              <w:t>Severity</w:t>
+              <w:t>Quality Dimension</w:t>
             </w:r>
           </w:p>
         </w:tc>
@@ -1809,7 +3321,7 @@
                 <w:color w:val="666666"/>
                 <w:sz w:val="18"/>
               </w:rPr>
-              <w:t>[ Critical / High / Medium / Low ]</w:t>
+              <w:t>[ Functionality / Workflow / Stability / Usability / Performance ]</w:t>
             </w:r>
           </w:p>
         </w:tc>
@@ -1839,7 +3351,7 @@
                 <w:color w:val="1F4E79"/>
                 <w:sz w:val="18"/>
               </w:rPr>
-              <w:t>Environment</w:t>
+              <w:t>Severity</w:t>
             </w:r>
           </w:p>
         </w:tc>
@@ -1866,7 +3378,7 @@
                 <w:color w:val="666666"/>
                 <w:sz w:val="18"/>
               </w:rPr>
-              <w:t>[ Device · OS · App version if known ]</w:t>
+              <w:t>[ Critical / High / Medium / Low ]</w:t>
             </w:r>
           </w:p>
         </w:tc>
@@ -1896,7 +3408,7 @@
                 <w:color w:val="1F4E79"/>
                 <w:sz w:val="18"/>
               </w:rPr>
-              <w:t>Frequency</w:t>
+              <w:t>Environment</w:t>
             </w:r>
           </w:p>
         </w:tc>
@@ -1923,7 +3435,7 @@
                 <w:color w:val="666666"/>
                 <w:sz w:val="18"/>
               </w:rPr>
-              <w:t>[ Always / Sometimes / Once ]</w:t>
+              <w:t>[ Device · OS · App version if known ]</w:t>
             </w:r>
           </w:p>
         </w:tc>
@@ -1953,7 +3465,7 @@
                 <w:color w:val="1F4E79"/>
                 <w:sz w:val="18"/>
               </w:rPr>
-              <w:t>Related to</w:t>
+              <w:t>Frequency</w:t>
             </w:r>
           </w:p>
         </w:tc>
@@ -1980,7 +3492,64 @@
                 <w:color w:val="666666"/>
                 <w:sz w:val="18"/>
               </w:rPr>
-              <w:t>[ Functionality / Usability / Performance / Stability / UI ]</w:t>
+              <w:t>[ Always / Sometimes / Once ]</w:t>
+            </w:r>
+          </w:p>
+        </w:tc>
+      </w:tr>
+      <w:tr>
+        <w:tc>
+          <w:tcPr>
+            <w:tcW w:type="dxa" w:w="4986"/>
+            <w:shd w:fill="E7E6E6" w:val="clear"/>
+            <w:tcBorders>
+              <w:top w:val="single" w:sz="4" w:color="BFBFBF"/>
+              <w:left w:val="single" w:sz="4" w:color="BFBFBF"/>
+              <w:bottom w:val="single" w:sz="4" w:color="BFBFBF"/>
+              <w:right w:val="single" w:sz="4" w:color="BFBFBF"/>
+            </w:tcBorders>
+          </w:tcPr>
+          <w:p>
+            <w:pPr>
+              <w:spacing w:before="40" w:after="40"/>
+            </w:pPr>
+            <w:r/>
+            <w:r>
+              <w:rPr>
+                <w:rFonts w:ascii="Calibri" w:hAnsi="Calibri" w:eastAsia="Calibri"/>
+                <w:b/>
+                <w:i w:val="0"/>
+                <w:color w:val="1F4E79"/>
+                <w:sz w:val="18"/>
+              </w:rPr>
+              <w:t>Related to</w:t>
+            </w:r>
+          </w:p>
+        </w:tc>
+        <w:tc>
+          <w:tcPr>
+            <w:tcW w:type="dxa" w:w="4986"/>
+            <w:tcBorders>
+              <w:top w:val="single" w:sz="4" w:color="BFBFBF"/>
+              <w:left w:val="single" w:sz="4" w:color="BFBFBF"/>
+              <w:bottom w:val="single" w:sz="4" w:color="BFBFBF"/>
+              <w:right w:val="single" w:sz="4" w:color="BFBFBF"/>
+            </w:tcBorders>
+          </w:tcPr>
+          <w:p>
+            <w:pPr>
+              <w:spacing w:before="40" w:after="40"/>
+            </w:pPr>
+            <w:r/>
+            <w:r>
+              <w:rPr>
+                <w:rFonts w:ascii="Calibri" w:hAnsi="Calibri" w:eastAsia="Calibri"/>
+                <w:b w:val="0"/>
+                <w:i/>
+                <w:color w:val="666666"/>
+                <w:sz w:val="18"/>
+              </w:rPr>
+              <w:t>[ Optional secondary tag ]</w:t>
             </w:r>
           </w:p>
         </w:tc>
@@ -2115,7 +3684,7 @@
     </w:p>
     <w:p>
       <w:pPr>
-        <w:spacing w:after="120" w:before="0"/>
+        <w:spacing w:after="120"/>
       </w:pPr>
       <w:r>
         <w:rPr>
@@ -2145,7 +3714,7 @@
     </w:p>
     <w:p>
       <w:pPr>
-        <w:spacing w:after="120" w:before="0"/>
+        <w:spacing w:after="120"/>
       </w:pPr>
       <w:r>
         <w:rPr>
@@ -2247,7 +3816,7 @@
     </w:p>
     <w:p>
       <w:pPr>
-        <w:spacing w:after="120" w:before="0"/>
+        <w:spacing w:after="120"/>
       </w:pPr>
       <w:r>
         <w:rPr>
@@ -2277,7 +3846,7 @@
     </w:p>
     <w:p>
       <w:pPr>
-        <w:spacing w:after="80" w:before="0"/>
+        <w:spacing w:after="80"/>
       </w:pPr>
       <w:r>
         <w:rPr>
@@ -2381,7 +3950,7 @@
                 <w:color w:val="1F4E79"/>
                 <w:sz w:val="18"/>
               </w:rPr>
-              <w:t>Severity</w:t>
+              <w:t>Quality Dimension</w:t>
             </w:r>
           </w:p>
         </w:tc>
@@ -2408,7 +3977,7 @@
                 <w:color w:val="666666"/>
                 <w:sz w:val="18"/>
               </w:rPr>
-              <w:t>[ Critical / High / Medium / Low ]</w:t>
+              <w:t>[ Functionality / Workflow / Stability / Usability / Performance ]</w:t>
             </w:r>
           </w:p>
         </w:tc>
@@ -2438,7 +4007,7 @@
                 <w:color w:val="1F4E79"/>
                 <w:sz w:val="18"/>
               </w:rPr>
-              <w:t>Environment</w:t>
+              <w:t>Severity</w:t>
             </w:r>
           </w:p>
         </w:tc>
@@ -2465,7 +4034,7 @@
                 <w:color w:val="666666"/>
                 <w:sz w:val="18"/>
               </w:rPr>
-              <w:t>[ Device · OS · App version if known ]</w:t>
+              <w:t>[ Critical / High / Medium / Low ]</w:t>
             </w:r>
           </w:p>
         </w:tc>
@@ -2495,7 +4064,7 @@
                 <w:color w:val="1F4E79"/>
                 <w:sz w:val="18"/>
               </w:rPr>
-              <w:t>Frequency</w:t>
+              <w:t>Environment</w:t>
             </w:r>
           </w:p>
         </w:tc>
@@ -2522,7 +4091,7 @@
                 <w:color w:val="666666"/>
                 <w:sz w:val="18"/>
               </w:rPr>
-              <w:t>[ Always / Sometimes / Once ]</w:t>
+              <w:t>[ Device · OS · App version if known ]</w:t>
             </w:r>
           </w:p>
         </w:tc>
@@ -2552,7 +4121,7 @@
                 <w:color w:val="1F4E79"/>
                 <w:sz w:val="18"/>
               </w:rPr>
-              <w:t>Related to</w:t>
+              <w:t>Frequency</w:t>
             </w:r>
           </w:p>
         </w:tc>
@@ -2579,7 +4148,64 @@
                 <w:color w:val="666666"/>
                 <w:sz w:val="18"/>
               </w:rPr>
-              <w:t>[ Functionality / Usability / Performance / Stability / UI ]</w:t>
+              <w:t>[ Always / Sometimes / Once ]</w:t>
+            </w:r>
+          </w:p>
+        </w:tc>
+      </w:tr>
+      <w:tr>
+        <w:tc>
+          <w:tcPr>
+            <w:tcW w:type="dxa" w:w="4986"/>
+            <w:shd w:fill="E7E6E6" w:val="clear"/>
+            <w:tcBorders>
+              <w:top w:val="single" w:sz="4" w:color="BFBFBF"/>
+              <w:left w:val="single" w:sz="4" w:color="BFBFBF"/>
+              <w:bottom w:val="single" w:sz="4" w:color="BFBFBF"/>
+              <w:right w:val="single" w:sz="4" w:color="BFBFBF"/>
+            </w:tcBorders>
+          </w:tcPr>
+          <w:p>
+            <w:pPr>
+              <w:spacing w:before="40" w:after="40"/>
+            </w:pPr>
+            <w:r/>
+            <w:r>
+              <w:rPr>
+                <w:rFonts w:ascii="Calibri" w:hAnsi="Calibri" w:eastAsia="Calibri"/>
+                <w:b/>
+                <w:i w:val="0"/>
+                <w:color w:val="1F4E79"/>
+                <w:sz w:val="18"/>
+              </w:rPr>
+              <w:t>Related to</w:t>
+            </w:r>
+          </w:p>
+        </w:tc>
+        <w:tc>
+          <w:tcPr>
+            <w:tcW w:type="dxa" w:w="4986"/>
+            <w:tcBorders>
+              <w:top w:val="single" w:sz="4" w:color="BFBFBF"/>
+              <w:left w:val="single" w:sz="4" w:color="BFBFBF"/>
+              <w:bottom w:val="single" w:sz="4" w:color="BFBFBF"/>
+              <w:right w:val="single" w:sz="4" w:color="BFBFBF"/>
+            </w:tcBorders>
+          </w:tcPr>
+          <w:p>
+            <w:pPr>
+              <w:spacing w:before="40" w:after="40"/>
+            </w:pPr>
+            <w:r/>
+            <w:r>
+              <w:rPr>
+                <w:rFonts w:ascii="Calibri" w:hAnsi="Calibri" w:eastAsia="Calibri"/>
+                <w:b w:val="0"/>
+                <w:i/>
+                <w:color w:val="666666"/>
+                <w:sz w:val="18"/>
+              </w:rPr>
+              <w:t>[ Optional secondary tag ]</w:t>
             </w:r>
           </w:p>
         </w:tc>
@@ -2714,7 +4340,7 @@
     </w:p>
     <w:p>
       <w:pPr>
-        <w:spacing w:after="120" w:before="0"/>
+        <w:spacing w:after="120"/>
       </w:pPr>
       <w:r>
         <w:rPr>
@@ -2744,7 +4370,7 @@
     </w:p>
     <w:p>
       <w:pPr>
-        <w:spacing w:after="120" w:before="0"/>
+        <w:spacing w:after="120"/>
       </w:pPr>
       <w:r>
         <w:rPr>
@@ -2846,7 +4472,7 @@
     </w:p>
     <w:p>
       <w:pPr>
-        <w:spacing w:after="120" w:before="0"/>
+        <w:spacing w:after="120"/>
       </w:pPr>
       <w:r>
         <w:rPr>
@@ -2876,7 +4502,7 @@
     </w:p>
     <w:p>
       <w:pPr>
-        <w:spacing w:after="80" w:before="0"/>
+        <w:spacing w:after="80"/>
       </w:pPr>
       <w:r>
         <w:rPr>
@@ -2980,7 +4606,7 @@
                 <w:color w:val="1F4E79"/>
                 <w:sz w:val="18"/>
               </w:rPr>
-              <w:t>Severity</w:t>
+              <w:t>Quality Dimension</w:t>
             </w:r>
           </w:p>
         </w:tc>
@@ -3007,7 +4633,7 @@
                 <w:color w:val="666666"/>
                 <w:sz w:val="18"/>
               </w:rPr>
-              <w:t>[ Critical / High / Medium / Low ]</w:t>
+              <w:t>[ Functionality / Workflow / Stability / Usability / Performance ]</w:t>
             </w:r>
           </w:p>
         </w:tc>
@@ -3037,7 +4663,7 @@
                 <w:color w:val="1F4E79"/>
                 <w:sz w:val="18"/>
               </w:rPr>
-              <w:t>Environment</w:t>
+              <w:t>Severity</w:t>
             </w:r>
           </w:p>
         </w:tc>
@@ -3064,7 +4690,7 @@
                 <w:color w:val="666666"/>
                 <w:sz w:val="18"/>
               </w:rPr>
-              <w:t>[ Device · OS · App version if known ]</w:t>
+              <w:t>[ Critical / High / Medium / Low ]</w:t>
             </w:r>
           </w:p>
         </w:tc>
@@ -3094,7 +4720,7 @@
                 <w:color w:val="1F4E79"/>
                 <w:sz w:val="18"/>
               </w:rPr>
-              <w:t>Frequency</w:t>
+              <w:t>Environment</w:t>
             </w:r>
           </w:p>
         </w:tc>
@@ -3121,7 +4747,7 @@
                 <w:color w:val="666666"/>
                 <w:sz w:val="18"/>
               </w:rPr>
-              <w:t>[ Always / Sometimes / Once ]</w:t>
+              <w:t>[ Device · OS · App version if known ]</w:t>
             </w:r>
           </w:p>
         </w:tc>
@@ -3151,7 +4777,7 @@
                 <w:color w:val="1F4E79"/>
                 <w:sz w:val="18"/>
               </w:rPr>
-              <w:t>Related to</w:t>
+              <w:t>Frequency</w:t>
             </w:r>
           </w:p>
         </w:tc>
@@ -3178,7 +4804,64 @@
                 <w:color w:val="666666"/>
                 <w:sz w:val="18"/>
               </w:rPr>
-              <w:t>[ Functionality / Usability / Performance / Stability / UI ]</w:t>
+              <w:t>[ Always / Sometimes / Once ]</w:t>
+            </w:r>
+          </w:p>
+        </w:tc>
+      </w:tr>
+      <w:tr>
+        <w:tc>
+          <w:tcPr>
+            <w:tcW w:type="dxa" w:w="4986"/>
+            <w:shd w:fill="E7E6E6" w:val="clear"/>
+            <w:tcBorders>
+              <w:top w:val="single" w:sz="4" w:color="BFBFBF"/>
+              <w:left w:val="single" w:sz="4" w:color="BFBFBF"/>
+              <w:bottom w:val="single" w:sz="4" w:color="BFBFBF"/>
+              <w:right w:val="single" w:sz="4" w:color="BFBFBF"/>
+            </w:tcBorders>
+          </w:tcPr>
+          <w:p>
+            <w:pPr>
+              <w:spacing w:before="40" w:after="40"/>
+            </w:pPr>
+            <w:r/>
+            <w:r>
+              <w:rPr>
+                <w:rFonts w:ascii="Calibri" w:hAnsi="Calibri" w:eastAsia="Calibri"/>
+                <w:b/>
+                <w:i w:val="0"/>
+                <w:color w:val="1F4E79"/>
+                <w:sz w:val="18"/>
+              </w:rPr>
+              <w:t>Related to</w:t>
+            </w:r>
+          </w:p>
+        </w:tc>
+        <w:tc>
+          <w:tcPr>
+            <w:tcW w:type="dxa" w:w="4986"/>
+            <w:tcBorders>
+              <w:top w:val="single" w:sz="4" w:color="BFBFBF"/>
+              <w:left w:val="single" w:sz="4" w:color="BFBFBF"/>
+              <w:bottom w:val="single" w:sz="4" w:color="BFBFBF"/>
+              <w:right w:val="single" w:sz="4" w:color="BFBFBF"/>
+            </w:tcBorders>
+          </w:tcPr>
+          <w:p>
+            <w:pPr>
+              <w:spacing w:before="40" w:after="40"/>
+            </w:pPr>
+            <w:r/>
+            <w:r>
+              <w:rPr>
+                <w:rFonts w:ascii="Calibri" w:hAnsi="Calibri" w:eastAsia="Calibri"/>
+                <w:b w:val="0"/>
+                <w:i/>
+                <w:color w:val="666666"/>
+                <w:sz w:val="18"/>
+              </w:rPr>
+              <w:t>[ Optional secondary tag ]</w:t>
             </w:r>
           </w:p>
         </w:tc>
@@ -3313,7 +4996,7 @@
     </w:p>
     <w:p>
       <w:pPr>
-        <w:spacing w:after="120" w:before="0"/>
+        <w:spacing w:after="120"/>
       </w:pPr>
       <w:r>
         <w:rPr>
@@ -3343,7 +5026,7 @@
     </w:p>
     <w:p>
       <w:pPr>
-        <w:spacing w:after="120" w:before="0"/>
+        <w:spacing w:after="120"/>
       </w:pPr>
       <w:r>
         <w:rPr>
@@ -3445,7 +5128,7 @@
     </w:p>
     <w:p>
       <w:pPr>
-        <w:spacing w:after="120" w:before="0"/>
+        <w:spacing w:after="120"/>
       </w:pPr>
       <w:r>
         <w:rPr>
@@ -3460,7 +5143,7 @@
     </w:p>
     <w:p>
       <w:pPr>
-        <w:spacing w:after="120" w:before="0"/>
+        <w:spacing w:after="120"/>
       </w:pPr>
       <w:r>
         <w:rPr>
@@ -3470,7 +5153,7 @@
           <w:color w:val="333333"/>
           <w:sz w:val="18"/>
         </w:rPr>
-        <w:t>→ Tip: When you find more bugs, tell me the title + steps + expected/actual + severity and I will add BUG-006, BUG-007, … as complete filled entries.</w:t>
+        <w:t>→ When you find more bugs, send title + steps + expected/actual + severity + dimension; I will add BUG-006+.</w:t>
       </w:r>
     </w:p>
     <w:p>
@@ -3490,7 +5173,7 @@
     </w:p>
     <w:p>
       <w:pPr>
-        <w:spacing w:after="120" w:before="0"/>
+        <w:spacing w:after="120"/>
       </w:pPr>
       <w:r>
         <w:rPr>
@@ -3500,9 +5183,140 @@
           <w:color w:val="333333"/>
           <w:sz w:val="20"/>
         </w:rPr>
-        <w:t>This section highlights positive product qualities observed during testing. For an internship review, balanced reporting (bugs + strengths) shows product understanding and analytical thinking — not only finding faults.</w:t>
+        <w:t>Strengths prove product understanding — not only finding faults. Tag each strength with a Quality Dimension. Examples by dimension:</w:t>
       </w:r>
     </w:p>
+    <w:p>
+      <w:pPr>
+        <w:spacing w:after="40"/>
+        <w:ind w:left="170"/>
+      </w:pPr>
+      <w:r>
+        <w:rPr>
+          <w:rFonts w:ascii="Calibri" w:hAnsi="Calibri" w:eastAsia="Calibri"/>
+          <w:b/>
+          <w:i w:val="0"/>
+          <w:color w:val="375E23"/>
+          <w:sz w:val="20"/>
+        </w:rPr>
+        <w:t xml:space="preserve">• Functionality: </w:t>
+      </w:r>
+      <w:r>
+        <w:rPr>
+          <w:rFonts w:ascii="Calibri" w:hAnsi="Calibri" w:eastAsia="Calibri"/>
+          <w:b w:val="0"/>
+          <w:i w:val="0"/>
+          <w:color w:val="333333"/>
+          <w:sz w:val="20"/>
+        </w:rPr>
+        <w:t>Save/share works correctly; batch selection behaves as expected.</w:t>
+      </w:r>
+    </w:p>
+    <w:p>
+      <w:pPr>
+        <w:spacing w:after="40"/>
+        <w:ind w:left="170"/>
+      </w:pPr>
+      <w:r>
+        <w:rPr>
+          <w:rFonts w:ascii="Calibri" w:hAnsi="Calibri" w:eastAsia="Calibri"/>
+          <w:b/>
+          <w:i w:val="0"/>
+          <w:color w:val="375E23"/>
+          <w:sz w:val="20"/>
+        </w:rPr>
+        <w:t xml:space="preserve">• Workflow: </w:t>
+      </w:r>
+      <w:r>
+        <w:rPr>
+          <w:rFonts w:ascii="Calibri" w:hAnsi="Calibri" w:eastAsia="Calibri"/>
+          <w:b w:val="0"/>
+          <w:i w:val="0"/>
+          <w:color w:val="333333"/>
+          <w:sz w:val="20"/>
+        </w:rPr>
+        <w:t>Clear path from Homepage → select → process → result → save.</w:t>
+      </w:r>
+    </w:p>
+    <w:p>
+      <w:pPr>
+        <w:spacing w:after="40"/>
+        <w:ind w:left="170"/>
+      </w:pPr>
+      <w:r>
+        <w:rPr>
+          <w:rFonts w:ascii="Calibri" w:hAnsi="Calibri" w:eastAsia="Calibri"/>
+          <w:b/>
+          <w:i w:val="0"/>
+          <w:color w:val="375E23"/>
+          <w:sz w:val="20"/>
+        </w:rPr>
+        <w:t xml:space="preserve">• Stability: </w:t>
+      </w:r>
+      <w:r>
+        <w:rPr>
+          <w:rFonts w:ascii="Calibri" w:hAnsi="Calibri" w:eastAsia="Calibri"/>
+          <w:b w:val="0"/>
+          <w:i w:val="0"/>
+          <w:color w:val="333333"/>
+          <w:sz w:val="20"/>
+        </w:rPr>
+        <w:t>App does not crash on Back during processing; resumes cleanly.</w:t>
+      </w:r>
+    </w:p>
+    <w:p>
+      <w:pPr>
+        <w:spacing w:after="40"/>
+        <w:ind w:left="170"/>
+      </w:pPr>
+      <w:r>
+        <w:rPr>
+          <w:rFonts w:ascii="Calibri" w:hAnsi="Calibri" w:eastAsia="Calibri"/>
+          <w:b/>
+          <w:i w:val="0"/>
+          <w:color w:val="375E23"/>
+          <w:sz w:val="20"/>
+        </w:rPr>
+        <w:t xml:space="preserve">• Usability: </w:t>
+      </w:r>
+      <w:r>
+        <w:rPr>
+          <w:rFonts w:ascii="Calibri" w:hAnsi="Calibri" w:eastAsia="Calibri"/>
+          <w:b w:val="0"/>
+          <w:i w:val="0"/>
+          <w:color w:val="333333"/>
+          <w:sz w:val="20"/>
+        </w:rPr>
+        <w:t>Clear CTAs, readable labels, helpful empty/loading states.</w:t>
+      </w:r>
+    </w:p>
+    <w:p>
+      <w:pPr>
+        <w:spacing w:after="40"/>
+        <w:ind w:left="170"/>
+      </w:pPr>
+      <w:r>
+        <w:rPr>
+          <w:rFonts w:ascii="Calibri" w:hAnsi="Calibri" w:eastAsia="Calibri"/>
+          <w:b/>
+          <w:i w:val="0"/>
+          <w:color w:val="375E23"/>
+          <w:sz w:val="20"/>
+        </w:rPr>
+        <w:t xml:space="preserve">• Performance: </w:t>
+      </w:r>
+      <w:r>
+        <w:rPr>
+          <w:rFonts w:ascii="Calibri" w:hAnsi="Calibri" w:eastAsia="Calibri"/>
+          <w:b w:val="0"/>
+          <w:i w:val="0"/>
+          <w:color w:val="333333"/>
+          <w:sz w:val="20"/>
+        </w:rPr>
+        <w:t>Progress shown quickly; UI stays responsive during batch.</w:t>
+      </w:r>
+    </w:p>
+    <w:p/>
     <w:p>
       <w:pPr>
         <w:spacing w:before="200" w:after="120"/>
@@ -3609,6 +5423,63 @@
                 <w:color w:val="375E23"/>
                 <w:sz w:val="18"/>
               </w:rPr>
+              <w:t>Quality Dimension</w:t>
+            </w:r>
+          </w:p>
+        </w:tc>
+        <w:tc>
+          <w:tcPr>
+            <w:tcW w:type="dxa" w:w="4986"/>
+            <w:tcBorders>
+              <w:top w:val="single" w:sz="4" w:color="BFBFBF"/>
+              <w:left w:val="single" w:sz="4" w:color="BFBFBF"/>
+              <w:bottom w:val="single" w:sz="4" w:color="BFBFBF"/>
+              <w:right w:val="single" w:sz="4" w:color="BFBFBF"/>
+            </w:tcBorders>
+          </w:tcPr>
+          <w:p>
+            <w:pPr>
+              <w:spacing w:before="40" w:after="40"/>
+            </w:pPr>
+            <w:r/>
+            <w:r>
+              <w:rPr>
+                <w:rFonts w:ascii="Calibri" w:hAnsi="Calibri" w:eastAsia="Calibri"/>
+                <w:b w:val="0"/>
+                <w:i/>
+                <w:color w:val="666666"/>
+                <w:sz w:val="18"/>
+              </w:rPr>
+              <w:t>[ Functionality / Workflow / Stability / Usability / Performance ]</w:t>
+            </w:r>
+          </w:p>
+        </w:tc>
+      </w:tr>
+      <w:tr>
+        <w:tc>
+          <w:tcPr>
+            <w:tcW w:type="dxa" w:w="4986"/>
+            <w:shd w:fill="E2EFDA" w:val="clear"/>
+            <w:tcBorders>
+              <w:top w:val="single" w:sz="4" w:color="BFBFBF"/>
+              <w:left w:val="single" w:sz="4" w:color="BFBFBF"/>
+              <w:bottom w:val="single" w:sz="4" w:color="BFBFBF"/>
+              <w:right w:val="single" w:sz="4" w:color="BFBFBF"/>
+            </w:tcBorders>
+          </w:tcPr>
+          <w:p>
+            <w:pPr>
+              <w:spacing w:before="40" w:after="40"/>
+            </w:pPr>
+            <w:r/>
+            <w:r>
+              <w:rPr>
+                <w:rFonts w:ascii="Calibri" w:hAnsi="Calibri" w:eastAsia="Calibri"/>
+                <w:b/>
+                <w:i w:val="0"/>
+                <w:color w:val="375E23"/>
+                <w:sz w:val="18"/>
+              </w:rPr>
               <w:t>Why it matters</w:t>
             </w:r>
           </w:p>
@@ -3717,7 +5588,7 @@
     </w:p>
     <w:p>
       <w:pPr>
-        <w:spacing w:after="120" w:before="0"/>
+        <w:spacing w:after="120"/>
       </w:pPr>
       <w:r>
         <w:rPr>
@@ -3908,6 +5779,63 @@
                 <w:color w:val="375E23"/>
                 <w:sz w:val="18"/>
               </w:rPr>
+              <w:t>Quality Dimension</w:t>
+            </w:r>
+          </w:p>
+        </w:tc>
+        <w:tc>
+          <w:tcPr>
+            <w:tcW w:type="dxa" w:w="4986"/>
+            <w:tcBorders>
+              <w:top w:val="single" w:sz="4" w:color="BFBFBF"/>
+              <w:left w:val="single" w:sz="4" w:color="BFBFBF"/>
+              <w:bottom w:val="single" w:sz="4" w:color="BFBFBF"/>
+              <w:right w:val="single" w:sz="4" w:color="BFBFBF"/>
+            </w:tcBorders>
+          </w:tcPr>
+          <w:p>
+            <w:pPr>
+              <w:spacing w:before="40" w:after="40"/>
+            </w:pPr>
+            <w:r/>
+            <w:r>
+              <w:rPr>
+                <w:rFonts w:ascii="Calibri" w:hAnsi="Calibri" w:eastAsia="Calibri"/>
+                <w:b w:val="0"/>
+                <w:i/>
+                <w:color w:val="666666"/>
+                <w:sz w:val="18"/>
+              </w:rPr>
+              <w:t>[ Functionality / Workflow / Stability / Usability / Performance ]</w:t>
+            </w:r>
+          </w:p>
+        </w:tc>
+      </w:tr>
+      <w:tr>
+        <w:tc>
+          <w:tcPr>
+            <w:tcW w:type="dxa" w:w="4986"/>
+            <w:shd w:fill="E2EFDA" w:val="clear"/>
+            <w:tcBorders>
+              <w:top w:val="single" w:sz="4" w:color="BFBFBF"/>
+              <w:left w:val="single" w:sz="4" w:color="BFBFBF"/>
+              <w:bottom w:val="single" w:sz="4" w:color="BFBFBF"/>
+              <w:right w:val="single" w:sz="4" w:color="BFBFBF"/>
+            </w:tcBorders>
+          </w:tcPr>
+          <w:p>
+            <w:pPr>
+              <w:spacing w:before="40" w:after="40"/>
+            </w:pPr>
+            <w:r/>
+            <w:r>
+              <w:rPr>
+                <w:rFonts w:ascii="Calibri" w:hAnsi="Calibri" w:eastAsia="Calibri"/>
+                <w:b/>
+                <w:i w:val="0"/>
+                <w:color w:val="375E23"/>
+                <w:sz w:val="18"/>
+              </w:rPr>
               <w:t>Why it matters</w:t>
             </w:r>
           </w:p>
@@ -4016,7 +5944,7 @@
     </w:p>
     <w:p>
       <w:pPr>
-        <w:spacing w:after="120" w:before="0"/>
+        <w:spacing w:after="120"/>
       </w:pPr>
       <w:r>
         <w:rPr>
@@ -4207,6 +6135,63 @@
                 <w:color w:val="375E23"/>
                 <w:sz w:val="18"/>
               </w:rPr>
+              <w:t>Quality Dimension</w:t>
+            </w:r>
+          </w:p>
+        </w:tc>
+        <w:tc>
+          <w:tcPr>
+            <w:tcW w:type="dxa" w:w="4986"/>
+            <w:tcBorders>
+              <w:top w:val="single" w:sz="4" w:color="BFBFBF"/>
+              <w:left w:val="single" w:sz="4" w:color="BFBFBF"/>
+              <w:bottom w:val="single" w:sz="4" w:color="BFBFBF"/>
+              <w:right w:val="single" w:sz="4" w:color="BFBFBF"/>
+            </w:tcBorders>
+          </w:tcPr>
+          <w:p>
+            <w:pPr>
+              <w:spacing w:before="40" w:after="40"/>
+            </w:pPr>
+            <w:r/>
+            <w:r>
+              <w:rPr>
+                <w:rFonts w:ascii="Calibri" w:hAnsi="Calibri" w:eastAsia="Calibri"/>
+                <w:b w:val="0"/>
+                <w:i/>
+                <w:color w:val="666666"/>
+                <w:sz w:val="18"/>
+              </w:rPr>
+              <w:t>[ Functionality / Workflow / Stability / Usability / Performance ]</w:t>
+            </w:r>
+          </w:p>
+        </w:tc>
+      </w:tr>
+      <w:tr>
+        <w:tc>
+          <w:tcPr>
+            <w:tcW w:type="dxa" w:w="4986"/>
+            <w:shd w:fill="E2EFDA" w:val="clear"/>
+            <w:tcBorders>
+              <w:top w:val="single" w:sz="4" w:color="BFBFBF"/>
+              <w:left w:val="single" w:sz="4" w:color="BFBFBF"/>
+              <w:bottom w:val="single" w:sz="4" w:color="BFBFBF"/>
+              <w:right w:val="single" w:sz="4" w:color="BFBFBF"/>
+            </w:tcBorders>
+          </w:tcPr>
+          <w:p>
+            <w:pPr>
+              <w:spacing w:before="40" w:after="40"/>
+            </w:pPr>
+            <w:r/>
+            <w:r>
+              <w:rPr>
+                <w:rFonts w:ascii="Calibri" w:hAnsi="Calibri" w:eastAsia="Calibri"/>
+                <w:b/>
+                <w:i w:val="0"/>
+                <w:color w:val="375E23"/>
+                <w:sz w:val="18"/>
+              </w:rPr>
               <w:t>Why it matters</w:t>
             </w:r>
           </w:p>
@@ -4315,7 +6300,7 @@
     </w:p>
     <w:p>
       <w:pPr>
-        <w:spacing w:after="120" w:before="0"/>
+        <w:spacing w:after="120"/>
       </w:pPr>
       <w:r>
         <w:rPr>
@@ -4506,6 +6491,63 @@
                 <w:color w:val="375E23"/>
                 <w:sz w:val="18"/>
               </w:rPr>
+              <w:t>Quality Dimension</w:t>
+            </w:r>
+          </w:p>
+        </w:tc>
+        <w:tc>
+          <w:tcPr>
+            <w:tcW w:type="dxa" w:w="4986"/>
+            <w:tcBorders>
+              <w:top w:val="single" w:sz="4" w:color="BFBFBF"/>
+              <w:left w:val="single" w:sz="4" w:color="BFBFBF"/>
+              <w:bottom w:val="single" w:sz="4" w:color="BFBFBF"/>
+              <w:right w:val="single" w:sz="4" w:color="BFBFBF"/>
+            </w:tcBorders>
+          </w:tcPr>
+          <w:p>
+            <w:pPr>
+              <w:spacing w:before="40" w:after="40"/>
+            </w:pPr>
+            <w:r/>
+            <w:r>
+              <w:rPr>
+                <w:rFonts w:ascii="Calibri" w:hAnsi="Calibri" w:eastAsia="Calibri"/>
+                <w:b w:val="0"/>
+                <w:i/>
+                <w:color w:val="666666"/>
+                <w:sz w:val="18"/>
+              </w:rPr>
+              <w:t>[ Functionality / Workflow / Stability / Usability / Performance ]</w:t>
+            </w:r>
+          </w:p>
+        </w:tc>
+      </w:tr>
+      <w:tr>
+        <w:tc>
+          <w:tcPr>
+            <w:tcW w:type="dxa" w:w="4986"/>
+            <w:shd w:fill="E2EFDA" w:val="clear"/>
+            <w:tcBorders>
+              <w:top w:val="single" w:sz="4" w:color="BFBFBF"/>
+              <w:left w:val="single" w:sz="4" w:color="BFBFBF"/>
+              <w:bottom w:val="single" w:sz="4" w:color="BFBFBF"/>
+              <w:right w:val="single" w:sz="4" w:color="BFBFBF"/>
+            </w:tcBorders>
+          </w:tcPr>
+          <w:p>
+            <w:pPr>
+              <w:spacing w:before="40" w:after="40"/>
+            </w:pPr>
+            <w:r/>
+            <w:r>
+              <w:rPr>
+                <w:rFonts w:ascii="Calibri" w:hAnsi="Calibri" w:eastAsia="Calibri"/>
+                <w:b/>
+                <w:i w:val="0"/>
+                <w:color w:val="375E23"/>
+                <w:sz w:val="18"/>
+              </w:rPr>
               <w:t>Why it matters</w:t>
             </w:r>
           </w:p>
@@ -4614,7 +6656,7 @@
     </w:p>
     <w:p>
       <w:pPr>
-        <w:spacing w:after="120" w:before="0"/>
+        <w:spacing w:after="120"/>
       </w:pPr>
       <w:r>
         <w:rPr>
@@ -4701,7 +6743,7 @@
     <w:p/>
     <w:p>
       <w:pPr>
-        <w:spacing w:after="120" w:before="0"/>
+        <w:spacing w:after="120"/>
       </w:pPr>
       <w:r>
         <w:rPr>
@@ -4711,7 +6753,7 @@
           <w:color w:val="333333"/>
           <w:sz w:val="18"/>
         </w:rPr>
-        <w:t>→ Tip: Tell me what the app does well (e.g. clear CTA, smooth gallery pick, good loading feedback) and I will turn it into a filled STR entry.</w:t>
+        <w:t>→ Aim for strengths across multiple dimensions (not only Usability).</w:t>
       </w:r>
     </w:p>
     <w:p>
@@ -4731,7 +6773,7 @@
     </w:p>
     <w:p>
       <w:pPr>
-        <w:spacing w:after="120" w:before="0"/>
+        <w:spacing w:after="120"/>
       </w:pPr>
       <w:r>
         <w:rPr>
@@ -4741,7 +6783,7 @@
           <w:color w:val="333333"/>
           <w:sz w:val="20"/>
         </w:rPr>
-        <w:t>Suggestions are not always bugs. They are product-quality ideas: usability, clarity, accessibility, workflow shortcuts, empty states, error messaging, confirmation dialogs, etc.</w:t>
+        <w:t>Suggestions are product-quality ideas (not always bugs). Tag by Quality Dimension. Good suggestions show analytical thinking: clearer errors (Usability), progress per image in batch (Performance), safer cancel (Stability), shorter steps (Workflow).</w:t>
       </w:r>
     </w:p>
     <w:p>
@@ -4850,6 +6892,63 @@
                 <w:color w:val="7F6000"/>
                 <w:sz w:val="18"/>
               </w:rPr>
+              <w:t>Quality Dimension</w:t>
+            </w:r>
+          </w:p>
+        </w:tc>
+        <w:tc>
+          <w:tcPr>
+            <w:tcW w:type="dxa" w:w="4986"/>
+            <w:tcBorders>
+              <w:top w:val="single" w:sz="4" w:color="BFBFBF"/>
+              <w:left w:val="single" w:sz="4" w:color="BFBFBF"/>
+              <w:bottom w:val="single" w:sz="4" w:color="BFBFBF"/>
+              <w:right w:val="single" w:sz="4" w:color="BFBFBF"/>
+            </w:tcBorders>
+          </w:tcPr>
+          <w:p>
+            <w:pPr>
+              <w:spacing w:before="40" w:after="40"/>
+            </w:pPr>
+            <w:r/>
+            <w:r>
+              <w:rPr>
+                <w:rFonts w:ascii="Calibri" w:hAnsi="Calibri" w:eastAsia="Calibri"/>
+                <w:b w:val="0"/>
+                <w:i/>
+                <w:color w:val="666666"/>
+                <w:sz w:val="18"/>
+              </w:rPr>
+              <w:t>[ Functionality / Workflow / Stability / Usability / Performance ]</w:t>
+            </w:r>
+          </w:p>
+        </w:tc>
+      </w:tr>
+      <w:tr>
+        <w:tc>
+          <w:tcPr>
+            <w:tcW w:type="dxa" w:w="4986"/>
+            <w:shd w:fill="FFF2CC" w:val="clear"/>
+            <w:tcBorders>
+              <w:top w:val="single" w:sz="4" w:color="BFBFBF"/>
+              <w:left w:val="single" w:sz="4" w:color="BFBFBF"/>
+              <w:bottom w:val="single" w:sz="4" w:color="BFBFBF"/>
+              <w:right w:val="single" w:sz="4" w:color="BFBFBF"/>
+            </w:tcBorders>
+          </w:tcPr>
+          <w:p>
+            <w:pPr>
+              <w:spacing w:before="40" w:after="40"/>
+            </w:pPr>
+            <w:r/>
+            <w:r>
+              <w:rPr>
+                <w:rFonts w:ascii="Calibri" w:hAnsi="Calibri" w:eastAsia="Calibri"/>
+                <w:b/>
+                <w:i w:val="0"/>
+                <w:color w:val="7F6000"/>
+                <w:sz w:val="18"/>
+              </w:rPr>
               <w:t>Priority</w:t>
             </w:r>
           </w:p>
@@ -5015,7 +7114,7 @@
     </w:p>
     <w:p>
       <w:pPr>
-        <w:spacing w:after="120" w:before="0"/>
+        <w:spacing w:after="120"/>
       </w:pPr>
       <w:r>
         <w:rPr>
@@ -5045,7 +7144,7 @@
     </w:p>
     <w:p>
       <w:pPr>
-        <w:spacing w:after="120" w:before="0"/>
+        <w:spacing w:after="120"/>
       </w:pPr>
       <w:r>
         <w:rPr>
@@ -5236,6 +7335,63 @@
                 <w:color w:val="7F6000"/>
                 <w:sz w:val="18"/>
               </w:rPr>
+              <w:t>Quality Dimension</w:t>
+            </w:r>
+          </w:p>
+        </w:tc>
+        <w:tc>
+          <w:tcPr>
+            <w:tcW w:type="dxa" w:w="4986"/>
+            <w:tcBorders>
+              <w:top w:val="single" w:sz="4" w:color="BFBFBF"/>
+              <w:left w:val="single" w:sz="4" w:color="BFBFBF"/>
+              <w:bottom w:val="single" w:sz="4" w:color="BFBFBF"/>
+              <w:right w:val="single" w:sz="4" w:color="BFBFBF"/>
+            </w:tcBorders>
+          </w:tcPr>
+          <w:p>
+            <w:pPr>
+              <w:spacing w:before="40" w:after="40"/>
+            </w:pPr>
+            <w:r/>
+            <w:r>
+              <w:rPr>
+                <w:rFonts w:ascii="Calibri" w:hAnsi="Calibri" w:eastAsia="Calibri"/>
+                <w:b w:val="0"/>
+                <w:i/>
+                <w:color w:val="666666"/>
+                <w:sz w:val="18"/>
+              </w:rPr>
+              <w:t>[ Functionality / Workflow / Stability / Usability / Performance ]</w:t>
+            </w:r>
+          </w:p>
+        </w:tc>
+      </w:tr>
+      <w:tr>
+        <w:tc>
+          <w:tcPr>
+            <w:tcW w:type="dxa" w:w="4986"/>
+            <w:shd w:fill="FFF2CC" w:val="clear"/>
+            <w:tcBorders>
+              <w:top w:val="single" w:sz="4" w:color="BFBFBF"/>
+              <w:left w:val="single" w:sz="4" w:color="BFBFBF"/>
+              <w:bottom w:val="single" w:sz="4" w:color="BFBFBF"/>
+              <w:right w:val="single" w:sz="4" w:color="BFBFBF"/>
+            </w:tcBorders>
+          </w:tcPr>
+          <w:p>
+            <w:pPr>
+              <w:spacing w:before="40" w:after="40"/>
+            </w:pPr>
+            <w:r/>
+            <w:r>
+              <w:rPr>
+                <w:rFonts w:ascii="Calibri" w:hAnsi="Calibri" w:eastAsia="Calibri"/>
+                <w:b/>
+                <w:i w:val="0"/>
+                <w:color w:val="7F6000"/>
+                <w:sz w:val="18"/>
+              </w:rPr>
               <w:t>Priority</w:t>
             </w:r>
           </w:p>
@@ -5401,7 +7557,7 @@
     </w:p>
     <w:p>
       <w:pPr>
-        <w:spacing w:after="120" w:before="0"/>
+        <w:spacing w:after="120"/>
       </w:pPr>
       <w:r>
         <w:rPr>
@@ -5431,7 +7587,7 @@
     </w:p>
     <w:p>
       <w:pPr>
-        <w:spacing w:after="120" w:before="0"/>
+        <w:spacing w:after="120"/>
       </w:pPr>
       <w:r>
         <w:rPr>
@@ -5622,6 +7778,63 @@
                 <w:color w:val="7F6000"/>
                 <w:sz w:val="18"/>
               </w:rPr>
+              <w:t>Quality Dimension</w:t>
+            </w:r>
+          </w:p>
+        </w:tc>
+        <w:tc>
+          <w:tcPr>
+            <w:tcW w:type="dxa" w:w="4986"/>
+            <w:tcBorders>
+              <w:top w:val="single" w:sz="4" w:color="BFBFBF"/>
+              <w:left w:val="single" w:sz="4" w:color="BFBFBF"/>
+              <w:bottom w:val="single" w:sz="4" w:color="BFBFBF"/>
+              <w:right w:val="single" w:sz="4" w:color="BFBFBF"/>
+            </w:tcBorders>
+          </w:tcPr>
+          <w:p>
+            <w:pPr>
+              <w:spacing w:before="40" w:after="40"/>
+            </w:pPr>
+            <w:r/>
+            <w:r>
+              <w:rPr>
+                <w:rFonts w:ascii="Calibri" w:hAnsi="Calibri" w:eastAsia="Calibri"/>
+                <w:b w:val="0"/>
+                <w:i/>
+                <w:color w:val="666666"/>
+                <w:sz w:val="18"/>
+              </w:rPr>
+              <w:t>[ Functionality / Workflow / Stability / Usability / Performance ]</w:t>
+            </w:r>
+          </w:p>
+        </w:tc>
+      </w:tr>
+      <w:tr>
+        <w:tc>
+          <w:tcPr>
+            <w:tcW w:type="dxa" w:w="4986"/>
+            <w:shd w:fill="FFF2CC" w:val="clear"/>
+            <w:tcBorders>
+              <w:top w:val="single" w:sz="4" w:color="BFBFBF"/>
+              <w:left w:val="single" w:sz="4" w:color="BFBFBF"/>
+              <w:bottom w:val="single" w:sz="4" w:color="BFBFBF"/>
+              <w:right w:val="single" w:sz="4" w:color="BFBFBF"/>
+            </w:tcBorders>
+          </w:tcPr>
+          <w:p>
+            <w:pPr>
+              <w:spacing w:before="40" w:after="40"/>
+            </w:pPr>
+            <w:r/>
+            <w:r>
+              <w:rPr>
+                <w:rFonts w:ascii="Calibri" w:hAnsi="Calibri" w:eastAsia="Calibri"/>
+                <w:b/>
+                <w:i w:val="0"/>
+                <w:color w:val="7F6000"/>
+                <w:sz w:val="18"/>
+              </w:rPr>
               <w:t>Priority</w:t>
             </w:r>
           </w:p>
@@ -5787,7 +8000,7 @@
     </w:p>
     <w:p>
       <w:pPr>
-        <w:spacing w:after="120" w:before="0"/>
+        <w:spacing w:after="120"/>
       </w:pPr>
       <w:r>
         <w:rPr>
@@ -5817,7 +8030,7 @@
     </w:p>
     <w:p>
       <w:pPr>
-        <w:spacing w:after="120" w:before="0"/>
+        <w:spacing w:after="120"/>
       </w:pPr>
       <w:r>
         <w:rPr>
@@ -6008,6 +8221,63 @@
                 <w:color w:val="7F6000"/>
                 <w:sz w:val="18"/>
               </w:rPr>
+              <w:t>Quality Dimension</w:t>
+            </w:r>
+          </w:p>
+        </w:tc>
+        <w:tc>
+          <w:tcPr>
+            <w:tcW w:type="dxa" w:w="4986"/>
+            <w:tcBorders>
+              <w:top w:val="single" w:sz="4" w:color="BFBFBF"/>
+              <w:left w:val="single" w:sz="4" w:color="BFBFBF"/>
+              <w:bottom w:val="single" w:sz="4" w:color="BFBFBF"/>
+              <w:right w:val="single" w:sz="4" w:color="BFBFBF"/>
+            </w:tcBorders>
+          </w:tcPr>
+          <w:p>
+            <w:pPr>
+              <w:spacing w:before="40" w:after="40"/>
+            </w:pPr>
+            <w:r/>
+            <w:r>
+              <w:rPr>
+                <w:rFonts w:ascii="Calibri" w:hAnsi="Calibri" w:eastAsia="Calibri"/>
+                <w:b w:val="0"/>
+                <w:i/>
+                <w:color w:val="666666"/>
+                <w:sz w:val="18"/>
+              </w:rPr>
+              <w:t>[ Functionality / Workflow / Stability / Usability / Performance ]</w:t>
+            </w:r>
+          </w:p>
+        </w:tc>
+      </w:tr>
+      <w:tr>
+        <w:tc>
+          <w:tcPr>
+            <w:tcW w:type="dxa" w:w="4986"/>
+            <w:shd w:fill="FFF2CC" w:val="clear"/>
+            <w:tcBorders>
+              <w:top w:val="single" w:sz="4" w:color="BFBFBF"/>
+              <w:left w:val="single" w:sz="4" w:color="BFBFBF"/>
+              <w:bottom w:val="single" w:sz="4" w:color="BFBFBF"/>
+              <w:right w:val="single" w:sz="4" w:color="BFBFBF"/>
+            </w:tcBorders>
+          </w:tcPr>
+          <w:p>
+            <w:pPr>
+              <w:spacing w:before="40" w:after="40"/>
+            </w:pPr>
+            <w:r/>
+            <w:r>
+              <w:rPr>
+                <w:rFonts w:ascii="Calibri" w:hAnsi="Calibri" w:eastAsia="Calibri"/>
+                <w:b/>
+                <w:i w:val="0"/>
+                <w:color w:val="7F6000"/>
+                <w:sz w:val="18"/>
+              </w:rPr>
               <w:t>Priority</w:t>
             </w:r>
           </w:p>
@@ -6173,7 +8443,7 @@
     </w:p>
     <w:p>
       <w:pPr>
-        <w:spacing w:after="120" w:before="0"/>
+        <w:spacing w:after="120"/>
       </w:pPr>
       <w:r>
         <w:rPr>
@@ -6203,7 +8473,7 @@
     </w:p>
     <w:p>
       <w:pPr>
-        <w:spacing w:after="120" w:before="0"/>
+        <w:spacing w:after="120"/>
       </w:pPr>
       <w:r>
         <w:rPr>
@@ -6290,7 +8560,7 @@
     <w:p/>
     <w:p>
       <w:pPr>
-        <w:spacing w:after="120" w:before="0"/>
+        <w:spacing w:after="120"/>
       </w:pPr>
       <w:r>
         <w:rPr>
@@ -6300,7 +8570,7 @@
           <w:color w:val="333333"/>
           <w:sz w:val="18"/>
         </w:rPr>
-        <w:t>→ Tip: Tell me the current pain + your idea, and I will write a complete SUG entry with priority and benefit.</w:t>
+        <w:t>→ Send current pain + idea + dimension; I will write a complete SUG entry.</w:t>
       </w:r>
     </w:p>
     <w:p>
@@ -6320,7 +8590,7 @@
     </w:p>
     <w:p>
       <w:pPr>
-        <w:spacing w:after="120" w:before="0"/>
+        <w:spacing w:after="120"/>
       </w:pPr>
       <w:r>
         <w:rPr>
@@ -6330,7 +8600,7 @@
           <w:color w:val="333333"/>
           <w:sz w:val="20"/>
         </w:rPr>
-        <w:t>Required by the assignment. Use Pass / Fail / Blocked / Not Executed. Link failed cases to Bug IDs (e.g. BUG-001). Expand rows as you cover more scenarios.</w:t>
+        <w:t>Required by the assignment. Status: Pass / Fail / Blocked / Not Executed. Link fails to Bug IDs. Quality Dimension column shows which assignment focus area each case covers.</w:t>
       </w:r>
     </w:p>
     <w:p>
@@ -6448,7 +8718,7 @@
                 <w:color w:val="FFFFFF"/>
                 <w:sz w:val="16"/>
               </w:rPr>
-              <w:t>Preconditions</w:t>
+              <w:t>Quality Dimension</w:t>
             </w:r>
           </w:p>
         </w:tc>
@@ -6650,7 +8920,7 @@
                 <w:color w:val="333333"/>
                 <w:sz w:val="16"/>
               </w:rPr>
-              <w:t>App installed &amp; launched</w:t>
+              <w:t>Workflow</w:t>
             </w:r>
           </w:p>
         </w:tc>
@@ -6706,7 +8976,7 @@
                 <w:color w:val="333333"/>
                 <w:sz w:val="16"/>
               </w:rPr>
-              <w:t>Feature screen opens successfully</w:t>
+              <w:t>Feature screen opens</w:t>
             </w:r>
           </w:p>
         </w:tc>
@@ -6848,7 +9118,7 @@
                 <w:color w:val="333333"/>
                 <w:sz w:val="16"/>
               </w:rPr>
-              <w:t>On BR screen</w:t>
+              <w:t>Functionality</w:t>
             </w:r>
           </w:p>
         </w:tc>
@@ -6876,7 +9146,7 @@
                 <w:color w:val="333333"/>
                 <w:sz w:val="16"/>
               </w:rPr>
-              <w:t>Choose Gallery → pick image</w:t>
+              <w:t>Gallery → pick image</w:t>
             </w:r>
           </w:p>
         </w:tc>
@@ -6904,7 +9174,7 @@
                 <w:color w:val="333333"/>
                 <w:sz w:val="16"/>
               </w:rPr>
-              <w:t>Selected image loads for processing</w:t>
+              <w:t>Image loads for processing</w:t>
             </w:r>
           </w:p>
         </w:tc>
@@ -7046,7 +9316,7 @@
                 <w:color w:val="333333"/>
                 <w:sz w:val="16"/>
               </w:rPr>
-              <w:t>Camera permission available</w:t>
+              <w:t>Functionality</w:t>
             </w:r>
           </w:p>
         </w:tc>
@@ -7074,7 +9344,7 @@
                 <w:color w:val="333333"/>
                 <w:sz w:val="16"/>
               </w:rPr>
-              <w:t>Choose Camera → capture</w:t>
+              <w:t>Camera → capture</w:t>
             </w:r>
           </w:p>
         </w:tc>
@@ -7102,7 +9372,7 @@
                 <w:color w:val="333333"/>
                 <w:sz w:val="16"/>
               </w:rPr>
-              <w:t>Captured image loads for processing</w:t>
+              <w:t>Captured image loads</w:t>
             </w:r>
           </w:p>
         </w:tc>
@@ -7216,7 +9486,7 @@
                 <w:color w:val="333333"/>
                 <w:sz w:val="16"/>
               </w:rPr>
-              <w:t>Permission denied handling (gallery/camera)</w:t>
+              <w:t>Permission denied handling</w:t>
             </w:r>
           </w:p>
         </w:tc>
@@ -7244,7 +9514,7 @@
                 <w:color w:val="333333"/>
                 <w:sz w:val="16"/>
               </w:rPr>
-              <w:t>Permissions not granted</w:t>
+              <w:t>Usability / Stability</w:t>
             </w:r>
           </w:p>
         </w:tc>
@@ -7272,7 +9542,7 @@
                 <w:color w:val="333333"/>
                 <w:sz w:val="16"/>
               </w:rPr>
-              <w:t>Deny permission when prompted</w:t>
+              <w:t>Deny permission</w:t>
             </w:r>
           </w:p>
         </w:tc>
@@ -7300,7 +9570,7 @@
                 <w:color w:val="333333"/>
                 <w:sz w:val="16"/>
               </w:rPr>
-              <w:t>Clear message / guidance; app does not crash</w:t>
+              <w:t>Clear guidance; no crash</w:t>
             </w:r>
           </w:p>
         </w:tc>
@@ -7442,7 +9712,7 @@
                 <w:color w:val="333333"/>
                 <w:sz w:val="16"/>
               </w:rPr>
-              <w:t>Image selected</w:t>
+              <w:t>Functionality / Performance</w:t>
             </w:r>
           </w:p>
         </w:tc>
@@ -7470,7 +9740,7 @@
                 <w:color w:val="333333"/>
                 <w:sz w:val="16"/>
               </w:rPr>
-              <w:t>Tap Remove / Process</w:t>
+              <w:t>Tap Remove/Process</w:t>
             </w:r>
           </w:p>
         </w:tc>
@@ -7498,7 +9768,7 @@
                 <w:color w:val="333333"/>
                 <w:sz w:val="16"/>
               </w:rPr>
-              <w:t>Loading/progress shown; result returned or clear error</w:t>
+              <w:t>Progress shown; result or clear error</w:t>
             </w:r>
           </w:p>
         </w:tc>
@@ -7612,7 +9882,7 @@
                 <w:color w:val="333333"/>
                 <w:sz w:val="16"/>
               </w:rPr>
-              <w:t>Cancel / back during processing</w:t>
+              <w:t>Cancel/back during processing</w:t>
             </w:r>
           </w:p>
         </w:tc>
@@ -7640,7 +9910,7 @@
                 <w:color w:val="333333"/>
                 <w:sz w:val="16"/>
               </w:rPr>
-              <w:t>Processing in progress</w:t>
+              <w:t>Stability / Workflow</w:t>
             </w:r>
           </w:p>
         </w:tc>
@@ -7668,7 +9938,7 @@
                 <w:color w:val="333333"/>
                 <w:sz w:val="16"/>
               </w:rPr>
-              <w:t>Press Back / Cancel</w:t>
+              <w:t>Back/Cancel mid-process</w:t>
             </w:r>
           </w:p>
         </w:tc>
@@ -7696,7 +9966,7 @@
                 <w:color w:val="333333"/>
                 <w:sz w:val="16"/>
               </w:rPr>
-              <w:t>App remains stable; predictable state</w:t>
+              <w:t>App stable; predictable state</w:t>
             </w:r>
           </w:p>
         </w:tc>
@@ -7838,7 +10108,7 @@
                 <w:color w:val="333333"/>
                 <w:sz w:val="16"/>
               </w:rPr>
-              <w:t>Result ready</w:t>
+              <w:t>Functionality</w:t>
             </w:r>
           </w:p>
         </w:tc>
@@ -7894,7 +10164,7 @@
                 <w:color w:val="333333"/>
                 <w:sz w:val="16"/>
               </w:rPr>
-              <w:t>Image saved; user gets confirmation</w:t>
+              <w:t>Saved + confirmation</w:t>
             </w:r>
           </w:p>
         </w:tc>
@@ -8036,7 +10306,7 @@
                 <w:color w:val="333333"/>
                 <w:sz w:val="16"/>
               </w:rPr>
-              <w:t>Result ready</w:t>
+              <w:t>Functionality</w:t>
             </w:r>
           </w:p>
         </w:tc>
@@ -8092,7 +10362,7 @@
                 <w:color w:val="333333"/>
                 <w:sz w:val="16"/>
               </w:rPr>
-              <w:t>System share sheet opens with image</w:t>
+              <w:t>Share sheet opens</w:t>
             </w:r>
           </w:p>
         </w:tc>
@@ -8234,7 +10504,7 @@
                 <w:color w:val="333333"/>
                 <w:sz w:val="16"/>
               </w:rPr>
-              <w:t>Image already selected</w:t>
+              <w:t>Workflow</w:t>
             </w:r>
           </w:p>
         </w:tc>
@@ -8290,7 +10560,7 @@
                 <w:color w:val="333333"/>
                 <w:sz w:val="16"/>
               </w:rPr>
-              <w:t>New image replaces old; flow continues</w:t>
+              <w:t>New image replaces old</w:t>
             </w:r>
           </w:p>
         </w:tc>
@@ -8404,7 +10674,7 @@
                 <w:color w:val="333333"/>
                 <w:sz w:val="16"/>
               </w:rPr>
-              <w:t>Unsupported / corrupt file handling</w:t>
+              <w:t>Unsupported/corrupt file</w:t>
             </w:r>
           </w:p>
         </w:tc>
@@ -8432,7 +10702,7 @@
                 <w:color w:val="333333"/>
                 <w:sz w:val="16"/>
               </w:rPr>
-              <w:t>Odd file available</w:t>
+              <w:t>Stability</w:t>
             </w:r>
           </w:p>
         </w:tc>
@@ -8460,7 +10730,7 @@
                 <w:color w:val="333333"/>
                 <w:sz w:val="16"/>
               </w:rPr>
-              <w:t>Try invalid image type if possible</w:t>
+              <w:t>Try invalid image if possible</w:t>
             </w:r>
           </w:p>
         </w:tc>
@@ -8630,7 +10900,7 @@
                 <w:color w:val="333333"/>
                 <w:sz w:val="16"/>
               </w:rPr>
-              <w:t>Airplane mode or weak net</w:t>
+              <w:t>Stability / Usability</w:t>
             </w:r>
           </w:p>
         </w:tc>
@@ -8658,7 +10928,7 @@
                 <w:color w:val="333333"/>
                 <w:sz w:val="16"/>
               </w:rPr>
-              <w:t>Attempt remove</w:t>
+              <w:t>Airplane mode → remove</w:t>
             </w:r>
           </w:p>
         </w:tc>
@@ -8686,7 +10956,7 @@
                 <w:color w:val="333333"/>
                 <w:sz w:val="16"/>
               </w:rPr>
-              <w:t>Clear offline/error state; no silent failure</w:t>
+              <w:t>Clear offline/error state</w:t>
             </w:r>
           </w:p>
         </w:tc>
@@ -8800,7 +11070,7 @@
                 <w:color w:val="333333"/>
                 <w:sz w:val="16"/>
               </w:rPr>
-              <w:t>UI layout on small screen / rotation*</w:t>
+              <w:t>UI on small screen</w:t>
             </w:r>
           </w:p>
         </w:tc>
@@ -8828,7 +11098,7 @@
                 <w:color w:val="333333"/>
                 <w:sz w:val="16"/>
               </w:rPr>
-              <w:t>Phone in use</w:t>
+              <w:t>Usability</w:t>
             </w:r>
           </w:p>
         </w:tc>
@@ -8856,7 +11126,7 @@
                 <w:color w:val="333333"/>
                 <w:sz w:val="16"/>
               </w:rPr>
-              <w:t>Check labels, buttons, scroll</w:t>
+              <w:t>Check labels/buttons/scroll</w:t>
             </w:r>
           </w:p>
         </w:tc>
@@ -8884,7 +11154,7 @@
                 <w:color w:val="333333"/>
                 <w:sz w:val="16"/>
               </w:rPr>
-              <w:t>Controls usable; no clipped CTAs</w:t>
+              <w:t>Controls usable; no clipped CTA</w:t>
             </w:r>
           </w:p>
         </w:tc>
@@ -9062,7 +11332,7 @@
                 <w:color w:val="FFFFFF"/>
                 <w:sz w:val="16"/>
               </w:rPr>
-              <w:t>Preconditions</w:t>
+              <w:t>Quality Dimension</w:t>
             </w:r>
           </w:p>
         </w:tc>
@@ -9264,7 +11534,7 @@
                 <w:color w:val="333333"/>
                 <w:sz w:val="16"/>
               </w:rPr>
-              <w:t>App launched</w:t>
+              <w:t>Workflow</w:t>
             </w:r>
           </w:p>
         </w:tc>
@@ -9462,7 +11732,7 @@
                 <w:color w:val="333333"/>
                 <w:sz w:val="16"/>
               </w:rPr>
-              <w:t>On Batch screen</w:t>
+              <w:t>Functionality</w:t>
             </w:r>
           </w:p>
         </w:tc>
@@ -9518,7 +11788,7 @@
                 <w:color w:val="333333"/>
                 <w:sz w:val="16"/>
               </w:rPr>
-              <w:t>All selected images listed/previewed</w:t>
+              <w:t>All listed/previewed</w:t>
             </w:r>
           </w:p>
         </w:tc>
@@ -9632,7 +11902,7 @@
                 <w:color w:val="333333"/>
                 <w:sz w:val="16"/>
               </w:rPr>
-              <w:t>Select single image in batch flow</w:t>
+              <w:t>Select single image in batch</w:t>
             </w:r>
           </w:p>
         </w:tc>
@@ -9660,7 +11930,7 @@
                 <w:color w:val="333333"/>
                 <w:sz w:val="16"/>
               </w:rPr>
-              <w:t>On Batch screen</w:t>
+              <w:t>Functionality / Usability</w:t>
             </w:r>
           </w:p>
         </w:tc>
@@ -9716,7 +11986,7 @@
                 <w:color w:val="333333"/>
                 <w:sz w:val="16"/>
               </w:rPr>
-              <w:t>Accepted or clear guidance shown</w:t>
+              <w:t>Accepted or clear guidance</w:t>
             </w:r>
           </w:p>
         </w:tc>
@@ -9858,7 +12128,7 @@
                 <w:color w:val="333333"/>
                 <w:sz w:val="16"/>
               </w:rPr>
-              <w:t>Many images available</w:t>
+              <w:t>Functionality / Usability</w:t>
             </w:r>
           </w:p>
         </w:tc>
@@ -9886,7 +12156,7 @@
                 <w:color w:val="333333"/>
                 <w:sz w:val="16"/>
               </w:rPr>
-              <w:t>Select beyond any limit</w:t>
+              <w:t>Select beyond limit</w:t>
             </w:r>
           </w:p>
         </w:tc>
@@ -9914,7 +12184,7 @@
                 <w:color w:val="333333"/>
                 <w:sz w:val="16"/>
               </w:rPr>
-              <w:t>Limit enforced with clear message</w:t>
+              <w:t>Limit + clear message</w:t>
             </w:r>
           </w:p>
         </w:tc>
@@ -10056,7 +12326,7 @@
                 <w:color w:val="333333"/>
                 <w:sz w:val="16"/>
               </w:rPr>
-              <w:t>Multiple selected</w:t>
+              <w:t>Workflow</w:t>
             </w:r>
           </w:p>
         </w:tc>
@@ -10084,7 +12354,7 @@
                 <w:color w:val="333333"/>
                 <w:sz w:val="16"/>
               </w:rPr>
-              <w:t>Deselect / remove one</w:t>
+              <w:t>Deselect one</w:t>
             </w:r>
           </w:p>
         </w:tc>
@@ -10112,7 +12382,7 @@
                 <w:color w:val="333333"/>
                 <w:sz w:val="16"/>
               </w:rPr>
-              <w:t>Selection updates correctly</w:t>
+              <w:t>Selection updates</w:t>
             </w:r>
           </w:p>
         </w:tc>
@@ -10254,7 +12524,7 @@
                 <w:color w:val="333333"/>
                 <w:sz w:val="16"/>
               </w:rPr>
-              <w:t>Images selected</w:t>
+              <w:t>Functionality / Performance</w:t>
             </w:r>
           </w:p>
         </w:tc>
@@ -10282,7 +12552,7 @@
                 <w:color w:val="333333"/>
                 <w:sz w:val="16"/>
               </w:rPr>
-              <w:t>Tap Process/Remove</w:t>
+              <w:t>Tap Process</w:t>
             </w:r>
           </w:p>
         </w:tc>
@@ -10310,7 +12580,7 @@
                 <w:color w:val="333333"/>
                 <w:sz w:val="16"/>
               </w:rPr>
-              <w:t>Progress for batch; results for each</w:t>
+              <w:t>Progress + results</w:t>
             </w:r>
           </w:p>
         </w:tc>
@@ -10452,7 +12722,7 @@
                 <w:color w:val="333333"/>
                 <w:sz w:val="16"/>
               </w:rPr>
-              <w:t>Mixed valid/invalid or API fail</w:t>
+              <w:t>Stability / Usability</w:t>
             </w:r>
           </w:p>
         </w:tc>
@@ -10480,7 +12750,7 @@
                 <w:color w:val="333333"/>
                 <w:sz w:val="16"/>
               </w:rPr>
-              <w:t>Run batch</w:t>
+              <w:t>Run mixed/fail case</w:t>
             </w:r>
           </w:p>
         </w:tc>
@@ -10508,7 +12778,7 @@
                 <w:color w:val="333333"/>
                 <w:sz w:val="16"/>
               </w:rPr>
-              <w:t>Failed items reported; others may succeed</w:t>
+              <w:t>Failed items reported</w:t>
             </w:r>
           </w:p>
         </w:tc>
@@ -10650,7 +12920,7 @@
                 <w:color w:val="333333"/>
                 <w:sz w:val="16"/>
               </w:rPr>
-              <w:t>Batch running</w:t>
+              <w:t>Stability</w:t>
             </w:r>
           </w:p>
         </w:tc>
@@ -10678,7 +12948,7 @@
                 <w:color w:val="333333"/>
                 <w:sz w:val="16"/>
               </w:rPr>
-              <w:t>Cancel / Back</w:t>
+              <w:t>Cancel/Back</w:t>
             </w:r>
           </w:p>
         </w:tc>
@@ -10706,7 +12976,7 @@
                 <w:color w:val="333333"/>
                 <w:sz w:val="16"/>
               </w:rPr>
-              <w:t>Stable state; no corrupt UI</w:t>
+              <w:t>Stable; no corrupt UI</w:t>
             </w:r>
           </w:p>
         </w:tc>
@@ -10820,7 +13090,7 @@
                 <w:color w:val="333333"/>
                 <w:sz w:val="16"/>
               </w:rPr>
-              <w:t>Save all / save individual results</w:t>
+              <w:t>Save all / individual results</w:t>
             </w:r>
           </w:p>
         </w:tc>
@@ -10848,7 +13118,7 @@
                 <w:color w:val="333333"/>
                 <w:sz w:val="16"/>
               </w:rPr>
-              <w:t>Results ready</w:t>
+              <w:t>Functionality</w:t>
             </w:r>
           </w:p>
         </w:tc>
@@ -11046,7 +13316,7 @@
                 <w:color w:val="333333"/>
                 <w:sz w:val="16"/>
               </w:rPr>
-              <w:t>No images selected</w:t>
+              <w:t>Usability / Functionality</w:t>
             </w:r>
           </w:p>
         </w:tc>
@@ -11074,7 +13344,7 @@
                 <w:color w:val="333333"/>
                 <w:sz w:val="16"/>
               </w:rPr>
-              <w:t>Tap process</w:t>
+              <w:t>Process with none</w:t>
             </w:r>
           </w:p>
         </w:tc>
@@ -11102,7 +13372,7 @@
                 <w:color w:val="333333"/>
                 <w:sz w:val="16"/>
               </w:rPr>
-              <w:t>Validation message; no crash</w:t>
+              <w:t>Validation; no crash</w:t>
             </w:r>
           </w:p>
         </w:tc>
@@ -11244,7 +13514,7 @@
                 <w:color w:val="333333"/>
                 <w:sz w:val="16"/>
               </w:rPr>
-              <w:t>On Batch screen</w:t>
+              <w:t>Workflow</w:t>
             </w:r>
           </w:p>
         </w:tc>
@@ -11414,7 +13684,7 @@
                 <w:color w:val="333333"/>
                 <w:sz w:val="16"/>
               </w:rPr>
-              <w:t>Performance with larger batch</w:t>
+              <w:t>Larger batch performance</w:t>
             </w:r>
           </w:p>
         </w:tc>
@@ -11442,7 +13712,7 @@
                 <w:color w:val="333333"/>
                 <w:sz w:val="16"/>
               </w:rPr>
-              <w:t>Several images</w:t>
+              <w:t>Performance</w:t>
             </w:r>
           </w:p>
         </w:tc>
@@ -11470,7 +13740,7 @@
                 <w:color w:val="333333"/>
                 <w:sz w:val="16"/>
               </w:rPr>
-              <w:t>Process batch</w:t>
+              <w:t>Process several images</w:t>
             </w:r>
           </w:p>
         </w:tc>
@@ -11498,7 +13768,7 @@
                 <w:color w:val="333333"/>
                 <w:sz w:val="16"/>
               </w:rPr>
-              <w:t>App remains responsive; progress visible</w:t>
+              <w:t>Responsive + visible progress</w:t>
             </w:r>
           </w:p>
         </w:tc>
@@ -11573,7 +13843,7 @@
           <w:color w:val="2E75B6"/>
           <w:sz w:val="26"/>
         </w:rPr>
-        <w:t>5.3 Cross-cutting / Usability Checks</w:t>
+        <w:t>5.3 Cross-cutting / Usability &amp; Stability Checks</w:t>
       </w:r>
     </w:p>
     <w:tbl>
@@ -11676,7 +13946,7 @@
                 <w:color w:val="FFFFFF"/>
                 <w:sz w:val="16"/>
               </w:rPr>
-              <w:t>Preconditions</w:t>
+              <w:t>Quality Dimension</w:t>
             </w:r>
           </w:p>
         </w:tc>
@@ -11878,7 +14148,7 @@
                 <w:color w:val="333333"/>
                 <w:sz w:val="16"/>
               </w:rPr>
-              <w:t>Fresh launch</w:t>
+              <w:t>Usability</w:t>
             </w:r>
           </w:p>
         </w:tc>
@@ -11934,7 +14204,7 @@
                 <w:color w:val="333333"/>
                 <w:sz w:val="16"/>
               </w:rPr>
-              <w:t>Both modules clearly findable</w:t>
+              <w:t>Both modules findable</w:t>
             </w:r>
           </w:p>
         </w:tc>
@@ -12076,7 +14346,7 @@
                 <w:color w:val="333333"/>
                 <w:sz w:val="16"/>
               </w:rPr>
-              <w:t>Any process start</w:t>
+              <w:t>Usability / Performance</w:t>
             </w:r>
           </w:p>
         </w:tc>
@@ -12104,7 +14374,7 @@
                 <w:color w:val="333333"/>
                 <w:sz w:val="16"/>
               </w:rPr>
-              <w:t>Observe feedback</w:t>
+              <w:t>Start any process</w:t>
             </w:r>
           </w:p>
         </w:tc>
@@ -12132,7 +14402,7 @@
                 <w:color w:val="333333"/>
                 <w:sz w:val="16"/>
               </w:rPr>
-              <w:t>User knows something is happening</w:t>
+              <w:t>User sees progress feedback</w:t>
             </w:r>
           </w:p>
         </w:tc>
@@ -12274,7 +14544,7 @@
                 <w:color w:val="333333"/>
                 <w:sz w:val="16"/>
               </w:rPr>
-              <w:t>Force an error</w:t>
+              <w:t>Usability</w:t>
             </w:r>
           </w:p>
         </w:tc>
@@ -12302,7 +14572,7 @@
                 <w:color w:val="333333"/>
                 <w:sz w:val="16"/>
               </w:rPr>
-              <w:t>Read message</w:t>
+              <w:t>Force an error</w:t>
             </w:r>
           </w:p>
         </w:tc>
@@ -12330,7 +14600,7 @@
                 <w:color w:val="333333"/>
                 <w:sz w:val="16"/>
               </w:rPr>
-              <w:t>Actionable, non-technical wording</w:t>
+              <w:t>Actionable wording</w:t>
             </w:r>
           </w:p>
         </w:tc>
@@ -12472,7 +14742,7 @@
                 <w:color w:val="333333"/>
                 <w:sz w:val="16"/>
               </w:rPr>
-              <w:t>Deep in flow</w:t>
+              <w:t>Workflow / Usability</w:t>
             </w:r>
           </w:p>
         </w:tc>
@@ -12500,7 +14770,7 @@
                 <w:color w:val="333333"/>
                 <w:sz w:val="16"/>
               </w:rPr>
-              <w:t>Use system/app back</w:t>
+              <w:t>Use back in deep flow</w:t>
             </w:r>
           </w:p>
         </w:tc>
@@ -12528,7 +14798,7 @@
                 <w:color w:val="333333"/>
                 <w:sz w:val="16"/>
               </w:rPr>
-              <w:t>Predictable navigation; no loops</w:t>
+              <w:t>Predictable; no loops</w:t>
             </w:r>
           </w:p>
         </w:tc>
@@ -12670,7 +14940,7 @@
                 <w:color w:val="333333"/>
                 <w:sz w:val="16"/>
               </w:rPr>
-              <w:t>Mid-flow</w:t>
+              <w:t>Stability</w:t>
             </w:r>
           </w:p>
         </w:tc>
@@ -12698,7 +14968,7 @@
                 <w:color w:val="333333"/>
                 <w:sz w:val="16"/>
               </w:rPr>
-              <w:t>Home key → reopen</w:t>
+              <w:t>Home → reopen mid-flow</w:t>
             </w:r>
           </w:p>
         </w:tc>
@@ -12726,7 +14996,7 @@
                 <w:color w:val="333333"/>
                 <w:sz w:val="16"/>
               </w:rPr>
-              <w:t>State preserved or recovered safely</w:t>
+              <w:t>State preserved/safe recovery</w:t>
             </w:r>
           </w:p>
         </w:tc>
@@ -12868,7 +15138,7 @@
                 <w:color w:val="333333"/>
                 <w:sz w:val="16"/>
               </w:rPr>
-              <w:t>No prior images</w:t>
+              <w:t>Usability</w:t>
             </w:r>
           </w:p>
         </w:tc>
@@ -12896,7 +15166,7 @@
                 <w:color w:val="333333"/>
                 <w:sz w:val="16"/>
               </w:rPr>
-              <w:t>Open modules</w:t>
+              <w:t>Open with no prior images</w:t>
             </w:r>
           </w:p>
         </w:tc>
@@ -13093,7 +15363,7 @@
                 <w:color w:val="1F4E79"/>
                 <w:sz w:val="18"/>
               </w:rPr>
-              <w:t>Total Strengths Noted</w:t>
+              <w:t>Bugs by Dimension</w:t>
             </w:r>
           </w:p>
         </w:tc>
@@ -13120,7 +15390,7 @@
                 <w:color w:val="666666"/>
                 <w:sz w:val="18"/>
               </w:rPr>
-              <w:t>[ count ]</w:t>
+              <w:t>Func: __  Workflow: __  Stability: __  Usability: __  Perf: __</w:t>
             </w:r>
           </w:p>
         </w:tc>
@@ -13150,7 +15420,7 @@
                 <w:color w:val="1F4E79"/>
                 <w:sz w:val="18"/>
               </w:rPr>
-              <w:t>Total Suggestions</w:t>
+              <w:t>Total Strengths Noted</w:t>
             </w:r>
           </w:p>
         </w:tc>
@@ -13177,7 +15447,7 @@
                 <w:color w:val="666666"/>
                 <w:sz w:val="18"/>
               </w:rPr>
-              <w:t>[ count ]</w:t>
+              <w:t>[ count ]  (list dimensions covered)</w:t>
             </w:r>
           </w:p>
         </w:tc>
@@ -13207,7 +15477,7 @@
                 <w:color w:val="1F4E79"/>
                 <w:sz w:val="18"/>
               </w:rPr>
-              <w:t>Test Cases Executed</w:t>
+              <w:t>Total Suggestions</w:t>
             </w:r>
           </w:p>
         </w:tc>
@@ -13234,7 +15504,7 @@
                 <w:color w:val="666666"/>
                 <w:sz w:val="18"/>
               </w:rPr>
-              <w:t>[ executed / total ]</w:t>
+              <w:t>[ count ]  (list dimensions covered)</w:t>
             </w:r>
           </w:p>
         </w:tc>
@@ -13264,7 +15534,7 @@
                 <w:color w:val="1F4E79"/>
                 <w:sz w:val="18"/>
               </w:rPr>
-              <w:t>Pass / Fail / Blocked</w:t>
+              <w:t>Test Cases Executed</w:t>
             </w:r>
           </w:p>
         </w:tc>
@@ -13291,7 +15561,7 @@
                 <w:color w:val="666666"/>
                 <w:sz w:val="18"/>
               </w:rPr>
-              <w:t>Pass: __   Fail: __   Blocked: __</w:t>
+              <w:t>[ executed / total ]</w:t>
             </w:r>
           </w:p>
         </w:tc>
@@ -13321,7 +15591,7 @@
                 <w:color w:val="1F4E79"/>
                 <w:sz w:val="18"/>
               </w:rPr>
-              <w:t>Overall Impression (1–2 lines)</w:t>
+              <w:t>Pass / Fail / Blocked</w:t>
             </w:r>
           </w:p>
         </w:tc>
@@ -13348,7 +15618,121 @@
                 <w:color w:val="666666"/>
                 <w:sz w:val="18"/>
               </w:rPr>
-              <w:t>[ Short product-quality verdict ]</w:t>
+              <w:t>Pass: __   Fail: __   Blocked: __</w:t>
+            </w:r>
+          </w:p>
+        </w:tc>
+      </w:tr>
+      <w:tr>
+        <w:tc>
+          <w:tcPr>
+            <w:tcW w:type="dxa" w:w="4986"/>
+            <w:shd w:fill="D6E3F0" w:val="clear"/>
+            <w:tcBorders>
+              <w:top w:val="single" w:sz="4" w:color="BFBFBF"/>
+              <w:left w:val="single" w:sz="4" w:color="BFBFBF"/>
+              <w:bottom w:val="single" w:sz="4" w:color="BFBFBF"/>
+              <w:right w:val="single" w:sz="4" w:color="BFBFBF"/>
+            </w:tcBorders>
+          </w:tcPr>
+          <w:p>
+            <w:pPr>
+              <w:spacing w:before="40" w:after="40"/>
+            </w:pPr>
+            <w:r/>
+            <w:r>
+              <w:rPr>
+                <w:rFonts w:ascii="Calibri" w:hAnsi="Calibri" w:eastAsia="Calibri"/>
+                <w:b/>
+                <w:i w:val="0"/>
+                <w:color w:val="1F4E79"/>
+                <w:sz w:val="18"/>
+              </w:rPr>
+              <w:t>Coverage Matrix Complete?</w:t>
+            </w:r>
+          </w:p>
+        </w:tc>
+        <w:tc>
+          <w:tcPr>
+            <w:tcW w:type="dxa" w:w="4986"/>
+            <w:tcBorders>
+              <w:top w:val="single" w:sz="4" w:color="BFBFBF"/>
+              <w:left w:val="single" w:sz="4" w:color="BFBFBF"/>
+              <w:bottom w:val="single" w:sz="4" w:color="BFBFBF"/>
+              <w:right w:val="single" w:sz="4" w:color="BFBFBF"/>
+            </w:tcBorders>
+          </w:tcPr>
+          <w:p>
+            <w:pPr>
+              <w:spacing w:before="40" w:after="40"/>
+            </w:pPr>
+            <w:r/>
+            <w:r>
+              <w:rPr>
+                <w:rFonts w:ascii="Calibri" w:hAnsi="Calibri" w:eastAsia="Calibri"/>
+                <w:b w:val="0"/>
+                <w:i/>
+                <w:color w:val="666666"/>
+                <w:sz w:val="18"/>
+              </w:rPr>
+              <w:t>[ Yes / Partial — note gaps ]</w:t>
+            </w:r>
+          </w:p>
+        </w:tc>
+      </w:tr>
+      <w:tr>
+        <w:tc>
+          <w:tcPr>
+            <w:tcW w:type="dxa" w:w="4986"/>
+            <w:shd w:fill="D6E3F0" w:val="clear"/>
+            <w:tcBorders>
+              <w:top w:val="single" w:sz="4" w:color="BFBFBF"/>
+              <w:left w:val="single" w:sz="4" w:color="BFBFBF"/>
+              <w:bottom w:val="single" w:sz="4" w:color="BFBFBF"/>
+              <w:right w:val="single" w:sz="4" w:color="BFBFBF"/>
+            </w:tcBorders>
+          </w:tcPr>
+          <w:p>
+            <w:pPr>
+              <w:spacing w:before="40" w:after="40"/>
+            </w:pPr>
+            <w:r/>
+            <w:r>
+              <w:rPr>
+                <w:rFonts w:ascii="Calibri" w:hAnsi="Calibri" w:eastAsia="Calibri"/>
+                <w:b/>
+                <w:i w:val="0"/>
+                <w:color w:val="1F4E79"/>
+                <w:sz w:val="18"/>
+              </w:rPr>
+              <w:t>Overall Product Quality (1–2 lines)</w:t>
+            </w:r>
+          </w:p>
+        </w:tc>
+        <w:tc>
+          <w:tcPr>
+            <w:tcW w:type="dxa" w:w="4986"/>
+            <w:tcBorders>
+              <w:top w:val="single" w:sz="4" w:color="BFBFBF"/>
+              <w:left w:val="single" w:sz="4" w:color="BFBFBF"/>
+              <w:bottom w:val="single" w:sz="4" w:color="BFBFBF"/>
+              <w:right w:val="single" w:sz="4" w:color="BFBFBF"/>
+            </w:tcBorders>
+          </w:tcPr>
+          <w:p>
+            <w:pPr>
+              <w:spacing w:before="40" w:after="40"/>
+            </w:pPr>
+            <w:r/>
+            <w:r>
+              <w:rPr>
+                <w:rFonts w:ascii="Calibri" w:hAnsi="Calibri" w:eastAsia="Calibri"/>
+                <w:b w:val="0"/>
+                <w:i/>
+                <w:color w:val="666666"/>
+                <w:sz w:val="18"/>
+              </w:rPr>
+              <w:t>[ Balanced verdict across the 6 dimensions ]</w:t>
             </w:r>
           </w:p>
         </w:tc>
@@ -13372,7 +15756,7 @@
     </w:p>
     <w:p>
       <w:pPr>
-        <w:spacing w:after="120" w:before="0"/>
+        <w:spacing w:after="120"/>
       </w:pPr>
       <w:r>
         <w:rPr>
@@ -13382,22 +15766,20 @@
           <w:color w:val="333333"/>
           <w:sz w:val="20"/>
         </w:rPr>
-        <w:t>Workflow while you test on your phone:</w:t>
+        <w:t>1) You test on mobile and note findings.</w:t>
         <w:br/>
-        <w:t>1) You message me a finding (bug / strength / suggestion) with what you saw.</w:t>
+        <w:t>2) For each finding, tell me: type (Bug/Strength/Suggestion) + Quality Dimension + what you saw.</w:t>
         <w:br/>
-        <w:t>2) You provide exact reproduce steps (or I draft them from your description for you to confirm).</w:t>
+        <w:t>3) You paste screenshots into the matching gray box.</w:t>
         <w:br/>
-        <w:t>3) You paste the screenshot into the matching placeholder box in this Word file.</w:t>
+        <w:t>4) I complete the polished entry and update the Coverage Matrix.</w:t>
         <w:br/>
-        <w:t>4) I update the DOCX with a polished, internship-ready entry (clear title, severity, expected/actual, etc.).</w:t>
-        <w:br/>
-        <w:t>5) Before submission, we fill the Summary Dashboard and tidy naming/IDs.</w:t>
+        <w:t>5) Before submit, we fill Summary §6 with a short overall product-quality verdict.</w:t>
       </w:r>
     </w:p>
     <w:p>
       <w:pPr>
-        <w:spacing w:after="120" w:before="0"/>
+        <w:spacing w:after="120"/>
       </w:pPr>
       <w:r>
         <w:rPr>
@@ -13407,7 +15789,7 @@
           <w:color w:val="333333"/>
           <w:sz w:val="18"/>
         </w:rPr>
-        <w:t>Reminder (from assignment): Do not judge AI cutout perfection. Focus on workflow, functionality, stability, usability, performance, and product quality. Screenshots and screen recordings are appreciated.</w:t>
+        <w:t>Reminder: Do not judge AI cutout perfection. Focus on functionality, workflow, stability, usability, performance, and overall product quality.</w:t>
       </w:r>
     </w:p>
     <w:p>
@@ -13423,7 +15805,7 @@
           <w:color w:val="999999"/>
           <w:sz w:val="16"/>
         </w:rPr>
-        <w:t>Draft template prepared for iterative SQA documentation · Replace all [ bracketed ] placeholders</w:t>
+        <w:t>Draft template · Tag every finding with a Quality Dimension · Replace all [ bracketed ] placeholders</w:t>
       </w:r>
     </w:p>
     <w:sectPr>

</xml_diff>

<commit_message>
Log BUG-001: Shape reverts BG-removed image to original
Document High severity state-loss bug where Shape applies to the
original photo instead of the cleared-background result, with steps,
expected/actual, coverage matrix, and linked failing test case.

Co-authored-by: Showravkarmakar <Showrav88@users.noreply.github.com>
</commit_message>
<xml_diff>
--- a/SQA_Intern_Assignment_Test_Report_DRAFT.docx
+++ b/SQA_Intern_Assignment_Test_Report_DRAFT.docx
@@ -862,7 +862,7 @@
                 <w:color w:val="333333"/>
                 <w:sz w:val="16"/>
               </w:rPr>
-              <w:t>[ ]</w:t>
+              <w:t>BUG-001</w:t>
             </w:r>
           </w:p>
         </w:tc>
@@ -953,17 +953,18 @@
         <w:tc>
           <w:tcPr>
             <w:tcW w:type="dxa" w:w="1662"/>
-            <w:shd w:fill="FFFFFF" w:val="clear"/>
-            <w:tcBorders>
-              <w:top w:val="single" w:sz="4" w:color="BFBFBF"/>
-              <w:left w:val="single" w:sz="4" w:color="BFBFBF"/>
-              <w:bottom w:val="single" w:sz="4" w:color="BFBFBF"/>
-              <w:right w:val="single" w:sz="4" w:color="BFBFBF"/>
-            </w:tcBorders>
-          </w:tcPr>
-          <w:p>
-            <w:pPr>
-              <w:spacing w:before="40" w:after="40"/>
+            <w:shd w:fill="FFF2CC" w:val="clear"/>
+            <w:tcBorders>
+              <w:top w:val="single" w:sz="4" w:color="BFBFBF"/>
+              <w:left w:val="single" w:sz="4" w:color="BFBFBF"/>
+              <w:bottom w:val="single" w:sz="4" w:color="BFBFBF"/>
+              <w:right w:val="single" w:sz="4" w:color="BFBFBF"/>
+            </w:tcBorders>
+          </w:tcPr>
+          <w:p>
+            <w:pPr>
+              <w:spacing w:before="40" w:after="40"/>
+              <w:jc w:val="center"/>
             </w:pPr>
             <w:r/>
             <w:r>
@@ -974,7 +975,7 @@
                 <w:color w:val="333333"/>
                 <w:sz w:val="16"/>
               </w:rPr>
-              <w:t>[ ]</w:t>
+              <w:t>Partial</w:t>
             </w:r>
           </w:p>
         </w:tc>
@@ -1181,7 +1182,7 @@
         <w:tc>
           <w:tcPr>
             <w:tcW w:type="dxa" w:w="1662"/>
-            <w:shd w:fill="FFFFFF" w:val="clear"/>
+            <w:shd w:fill="F2F2F2" w:val="clear"/>
             <w:tcBorders>
               <w:top w:val="single" w:sz="4" w:color="BFBFBF"/>
               <w:left w:val="single" w:sz="4" w:color="BFBFBF"/>
@@ -1202,7 +1203,7 @@
                 <w:color w:val="333333"/>
                 <w:sz w:val="16"/>
               </w:rPr>
-              <w:t>[ ]</w:t>
+              <w:t>BUG-001</w:t>
             </w:r>
           </w:p>
         </w:tc>
@@ -1293,17 +1294,18 @@
         <w:tc>
           <w:tcPr>
             <w:tcW w:type="dxa" w:w="1662"/>
-            <w:shd w:fill="FFFFFF" w:val="clear"/>
-            <w:tcBorders>
-              <w:top w:val="single" w:sz="4" w:color="BFBFBF"/>
-              <w:left w:val="single" w:sz="4" w:color="BFBFBF"/>
-              <w:bottom w:val="single" w:sz="4" w:color="BFBFBF"/>
-              <w:right w:val="single" w:sz="4" w:color="BFBFBF"/>
-            </w:tcBorders>
-          </w:tcPr>
-          <w:p>
-            <w:pPr>
-              <w:spacing w:before="40" w:after="40"/>
+            <w:shd w:fill="FFF2CC" w:val="clear"/>
+            <w:tcBorders>
+              <w:top w:val="single" w:sz="4" w:color="BFBFBF"/>
+              <w:left w:val="single" w:sz="4" w:color="BFBFBF"/>
+              <w:bottom w:val="single" w:sz="4" w:color="BFBFBF"/>
+              <w:right w:val="single" w:sz="4" w:color="BFBFBF"/>
+            </w:tcBorders>
+          </w:tcPr>
+          <w:p>
+            <w:pPr>
+              <w:spacing w:before="40" w:after="40"/>
+              <w:jc w:val="center"/>
             </w:pPr>
             <w:r/>
             <w:r>
@@ -1314,7 +1316,7 @@
                 <w:color w:val="333333"/>
                 <w:sz w:val="16"/>
               </w:rPr>
-              <w:t>[ ]</w:t>
+              <w:t>Partial</w:t>
             </w:r>
           </w:p>
         </w:tc>
@@ -1873,7 +1875,7 @@
           <w:color w:val="2E75B6"/>
           <w:sz w:val="26"/>
         </w:rPr>
-        <w:t>Bug BUG-001: [ Short, clear bug title ]</w:t>
+        <w:t>Bug BUG-001: Shape tool reverts image to original background after successful BG removal</w:t>
       </w:r>
     </w:p>
     <w:p>
@@ -1885,10 +1887,10 @@
           <w:rFonts w:ascii="Calibri" w:hAnsi="Calibri" w:eastAsia="Calibri"/>
           <w:b w:val="0"/>
           <w:i/>
-          <w:color w:val="333333"/>
+          <w:color w:val="C00000"/>
           <w:sz w:val="18"/>
         </w:rPr>
-        <w:t>Status: DRAFT — fill when found</w:t>
+        <w:t>Status: LOGGED — awaiting screenshot evidence</w:t>
       </w:r>
     </w:p>
     <w:tbl>
@@ -1932,6 +1934,181 @@
         <w:tc>
           <w:tcPr>
             <w:tcW w:type="dxa" w:w="4986"/>
+            <w:shd w:fill="FFFFFF" w:val="clear"/>
+            <w:tcBorders>
+              <w:top w:val="single" w:sz="4" w:color="BFBFBF"/>
+              <w:left w:val="single" w:sz="4" w:color="BFBFBF"/>
+              <w:bottom w:val="single" w:sz="4" w:color="BFBFBF"/>
+              <w:right w:val="single" w:sz="4" w:color="BFBFBF"/>
+            </w:tcBorders>
+          </w:tcPr>
+          <w:p>
+            <w:pPr>
+              <w:spacing w:before="40" w:after="40"/>
+            </w:pPr>
+            <w:r/>
+            <w:r>
+              <w:rPr>
+                <w:rFonts w:ascii="Calibri" w:hAnsi="Calibri" w:eastAsia="Calibri"/>
+                <w:b w:val="0"/>
+                <w:i w:val="0"/>
+                <w:color w:val="333333"/>
+                <w:sz w:val="18"/>
+              </w:rPr>
+              <w:t>Background Remove (single image) → Shape feature</w:t>
+            </w:r>
+          </w:p>
+        </w:tc>
+      </w:tr>
+      <w:tr>
+        <w:tc>
+          <w:tcPr>
+            <w:tcW w:type="dxa" w:w="4986"/>
+            <w:shd w:fill="E7E6E6" w:val="clear"/>
+            <w:tcBorders>
+              <w:top w:val="single" w:sz="4" w:color="BFBFBF"/>
+              <w:left w:val="single" w:sz="4" w:color="BFBFBF"/>
+              <w:bottom w:val="single" w:sz="4" w:color="BFBFBF"/>
+              <w:right w:val="single" w:sz="4" w:color="BFBFBF"/>
+            </w:tcBorders>
+          </w:tcPr>
+          <w:p>
+            <w:pPr>
+              <w:spacing w:before="40" w:after="40"/>
+            </w:pPr>
+            <w:r/>
+            <w:r>
+              <w:rPr>
+                <w:rFonts w:ascii="Calibri" w:hAnsi="Calibri" w:eastAsia="Calibri"/>
+                <w:b/>
+                <w:i w:val="0"/>
+                <w:color w:val="1F4E79"/>
+                <w:sz w:val="18"/>
+              </w:rPr>
+              <w:t>Quality Dimension</w:t>
+            </w:r>
+          </w:p>
+        </w:tc>
+        <w:tc>
+          <w:tcPr>
+            <w:tcW w:type="dxa" w:w="4986"/>
+            <w:shd w:fill="FFFFFF" w:val="clear"/>
+            <w:tcBorders>
+              <w:top w:val="single" w:sz="4" w:color="BFBFBF"/>
+              <w:left w:val="single" w:sz="4" w:color="BFBFBF"/>
+              <w:bottom w:val="single" w:sz="4" w:color="BFBFBF"/>
+              <w:right w:val="single" w:sz="4" w:color="BFBFBF"/>
+            </w:tcBorders>
+          </w:tcPr>
+          <w:p>
+            <w:pPr>
+              <w:spacing w:before="40" w:after="40"/>
+            </w:pPr>
+            <w:r/>
+            <w:r>
+              <w:rPr>
+                <w:rFonts w:ascii="Calibri" w:hAnsi="Calibri" w:eastAsia="Calibri"/>
+                <w:b w:val="0"/>
+                <w:i w:val="0"/>
+                <w:color w:val="333333"/>
+                <w:sz w:val="18"/>
+              </w:rPr>
+              <w:t>Functionality / Stability (image state not preserved)</w:t>
+            </w:r>
+          </w:p>
+        </w:tc>
+      </w:tr>
+      <w:tr>
+        <w:tc>
+          <w:tcPr>
+            <w:tcW w:type="dxa" w:w="4986"/>
+            <w:shd w:fill="E7E6E6" w:val="clear"/>
+            <w:tcBorders>
+              <w:top w:val="single" w:sz="4" w:color="BFBFBF"/>
+              <w:left w:val="single" w:sz="4" w:color="BFBFBF"/>
+              <w:bottom w:val="single" w:sz="4" w:color="BFBFBF"/>
+              <w:right w:val="single" w:sz="4" w:color="BFBFBF"/>
+            </w:tcBorders>
+          </w:tcPr>
+          <w:p>
+            <w:pPr>
+              <w:spacing w:before="40" w:after="40"/>
+            </w:pPr>
+            <w:r/>
+            <w:r>
+              <w:rPr>
+                <w:rFonts w:ascii="Calibri" w:hAnsi="Calibri" w:eastAsia="Calibri"/>
+                <w:b/>
+                <w:i w:val="0"/>
+                <w:color w:val="1F4E79"/>
+                <w:sz w:val="18"/>
+              </w:rPr>
+              <w:t>Severity</w:t>
+            </w:r>
+          </w:p>
+        </w:tc>
+        <w:tc>
+          <w:tcPr>
+            <w:tcW w:type="dxa" w:w="4986"/>
+            <w:shd w:fill="FCE4D6" w:val="clear"/>
+            <w:tcBorders>
+              <w:top w:val="single" w:sz="4" w:color="BFBFBF"/>
+              <w:left w:val="single" w:sz="4" w:color="BFBFBF"/>
+              <w:bottom w:val="single" w:sz="4" w:color="BFBFBF"/>
+              <w:right w:val="single" w:sz="4" w:color="BFBFBF"/>
+            </w:tcBorders>
+          </w:tcPr>
+          <w:p>
+            <w:pPr>
+              <w:spacing w:before="40" w:after="40"/>
+            </w:pPr>
+            <w:r/>
+            <w:r>
+              <w:rPr>
+                <w:rFonts w:ascii="Calibri" w:hAnsi="Calibri" w:eastAsia="Calibri"/>
+                <w:b w:val="0"/>
+                <w:i w:val="0"/>
+                <w:color w:val="333333"/>
+                <w:sz w:val="18"/>
+              </w:rPr>
+              <w:t>High — Shape undoes the main BG-removal result when applied</w:t>
+            </w:r>
+          </w:p>
+        </w:tc>
+      </w:tr>
+      <w:tr>
+        <w:tc>
+          <w:tcPr>
+            <w:tcW w:type="dxa" w:w="4986"/>
+            <w:shd w:fill="E7E6E6" w:val="clear"/>
+            <w:tcBorders>
+              <w:top w:val="single" w:sz="4" w:color="BFBFBF"/>
+              <w:left w:val="single" w:sz="4" w:color="BFBFBF"/>
+              <w:bottom w:val="single" w:sz="4" w:color="BFBFBF"/>
+              <w:right w:val="single" w:sz="4" w:color="BFBFBF"/>
+            </w:tcBorders>
+          </w:tcPr>
+          <w:p>
+            <w:pPr>
+              <w:spacing w:before="40" w:after="40"/>
+            </w:pPr>
+            <w:r/>
+            <w:r>
+              <w:rPr>
+                <w:rFonts w:ascii="Calibri" w:hAnsi="Calibri" w:eastAsia="Calibri"/>
+                <w:b/>
+                <w:i w:val="0"/>
+                <w:color w:val="1F4E79"/>
+                <w:sz w:val="18"/>
+              </w:rPr>
+              <w:t>Environment</w:t>
+            </w:r>
+          </w:p>
+        </w:tc>
+        <w:tc>
+          <w:tcPr>
+            <w:tcW w:type="dxa" w:w="4986"/>
+            <w:shd w:fill="FFFFFF" w:val="clear"/>
             <w:tcBorders>
               <w:top w:val="single" w:sz="4" w:color="BFBFBF"/>
               <w:left w:val="single" w:sz="4" w:color="BFBFBF"/>
@@ -1952,7 +2129,7 @@
                 <w:color w:val="666666"/>
                 <w:sz w:val="18"/>
               </w:rPr>
-              <w:t>[ Background Remove / Batch Remover / Shared / Other ]</w:t>
+              <w:t>[ Device · OS — fill when adding screenshot ]</w:t>
             </w:r>
           </w:p>
         </w:tc>
@@ -1982,13 +2159,14 @@
                 <w:color w:val="1F4E79"/>
                 <w:sz w:val="18"/>
               </w:rPr>
-              <w:t>Quality Dimension</w:t>
+              <w:t>Frequency</w:t>
             </w:r>
           </w:p>
         </w:tc>
         <w:tc>
           <w:tcPr>
             <w:tcW w:type="dxa" w:w="4986"/>
+            <w:shd w:fill="FFFFFF" w:val="clear"/>
             <w:tcBorders>
               <w:top w:val="single" w:sz="4" w:color="BFBFBF"/>
               <w:left w:val="single" w:sz="4" w:color="BFBFBF"/>
@@ -2005,11 +2183,11 @@
               <w:rPr>
                 <w:rFonts w:ascii="Calibri" w:hAnsi="Calibri" w:eastAsia="Calibri"/>
                 <w:b w:val="0"/>
-                <w:i/>
-                <w:color w:val="666666"/>
+                <w:i w:val="0"/>
+                <w:color w:val="333333"/>
                 <w:sz w:val="18"/>
               </w:rPr>
-              <w:t>[ Functionality / Workflow / Stability / Usability / Performance ]</w:t>
+              <w:t>Always (reproduced on Shape interaction after auto BG remove)</w:t>
             </w:r>
           </w:p>
         </w:tc>
@@ -2039,13 +2217,14 @@
                 <w:color w:val="1F4E79"/>
                 <w:sz w:val="18"/>
               </w:rPr>
-              <w:t>Severity</w:t>
+              <w:t>Related to</w:t>
             </w:r>
           </w:p>
         </w:tc>
         <w:tc>
           <w:tcPr>
             <w:tcW w:type="dxa" w:w="4986"/>
+            <w:shd w:fill="FFFFFF" w:val="clear"/>
             <w:tcBorders>
               <w:top w:val="single" w:sz="4" w:color="BFBFBF"/>
               <w:left w:val="single" w:sz="4" w:color="BFBFBF"/>
@@ -2062,182 +2241,11 @@
               <w:rPr>
                 <w:rFonts w:ascii="Calibri" w:hAnsi="Calibri" w:eastAsia="Calibri"/>
                 <w:b w:val="0"/>
-                <w:i/>
-                <w:color w:val="666666"/>
+                <w:i w:val="0"/>
+                <w:color w:val="333333"/>
                 <w:sz w:val="18"/>
               </w:rPr>
-              <w:t>[ Critical / High / Medium / Low ]</w:t>
-            </w:r>
-          </w:p>
-        </w:tc>
-      </w:tr>
-      <w:tr>
-        <w:tc>
-          <w:tcPr>
-            <w:tcW w:type="dxa" w:w="4986"/>
-            <w:shd w:fill="E7E6E6" w:val="clear"/>
-            <w:tcBorders>
-              <w:top w:val="single" w:sz="4" w:color="BFBFBF"/>
-              <w:left w:val="single" w:sz="4" w:color="BFBFBF"/>
-              <w:bottom w:val="single" w:sz="4" w:color="BFBFBF"/>
-              <w:right w:val="single" w:sz="4" w:color="BFBFBF"/>
-            </w:tcBorders>
-          </w:tcPr>
-          <w:p>
-            <w:pPr>
-              <w:spacing w:before="40" w:after="40"/>
-            </w:pPr>
-            <w:r/>
-            <w:r>
-              <w:rPr>
-                <w:rFonts w:ascii="Calibri" w:hAnsi="Calibri" w:eastAsia="Calibri"/>
-                <w:b/>
-                <w:i w:val="0"/>
-                <w:color w:val="1F4E79"/>
-                <w:sz w:val="18"/>
-              </w:rPr>
-              <w:t>Environment</w:t>
-            </w:r>
-          </w:p>
-        </w:tc>
-        <w:tc>
-          <w:tcPr>
-            <w:tcW w:type="dxa" w:w="4986"/>
-            <w:tcBorders>
-              <w:top w:val="single" w:sz="4" w:color="BFBFBF"/>
-              <w:left w:val="single" w:sz="4" w:color="BFBFBF"/>
-              <w:bottom w:val="single" w:sz="4" w:color="BFBFBF"/>
-              <w:right w:val="single" w:sz="4" w:color="BFBFBF"/>
-            </w:tcBorders>
-          </w:tcPr>
-          <w:p>
-            <w:pPr>
-              <w:spacing w:before="40" w:after="40"/>
-            </w:pPr>
-            <w:r/>
-            <w:r>
-              <w:rPr>
-                <w:rFonts w:ascii="Calibri" w:hAnsi="Calibri" w:eastAsia="Calibri"/>
-                <w:b w:val="0"/>
-                <w:i/>
-                <w:color w:val="666666"/>
-                <w:sz w:val="18"/>
-              </w:rPr>
-              <w:t>[ Device · OS · App version if known ]</w:t>
-            </w:r>
-          </w:p>
-        </w:tc>
-      </w:tr>
-      <w:tr>
-        <w:tc>
-          <w:tcPr>
-            <w:tcW w:type="dxa" w:w="4986"/>
-            <w:shd w:fill="E7E6E6" w:val="clear"/>
-            <w:tcBorders>
-              <w:top w:val="single" w:sz="4" w:color="BFBFBF"/>
-              <w:left w:val="single" w:sz="4" w:color="BFBFBF"/>
-              <w:bottom w:val="single" w:sz="4" w:color="BFBFBF"/>
-              <w:right w:val="single" w:sz="4" w:color="BFBFBF"/>
-            </w:tcBorders>
-          </w:tcPr>
-          <w:p>
-            <w:pPr>
-              <w:spacing w:before="40" w:after="40"/>
-            </w:pPr>
-            <w:r/>
-            <w:r>
-              <w:rPr>
-                <w:rFonts w:ascii="Calibri" w:hAnsi="Calibri" w:eastAsia="Calibri"/>
-                <w:b/>
-                <w:i w:val="0"/>
-                <w:color w:val="1F4E79"/>
-                <w:sz w:val="18"/>
-              </w:rPr>
-              <w:t>Frequency</w:t>
-            </w:r>
-          </w:p>
-        </w:tc>
-        <w:tc>
-          <w:tcPr>
-            <w:tcW w:type="dxa" w:w="4986"/>
-            <w:tcBorders>
-              <w:top w:val="single" w:sz="4" w:color="BFBFBF"/>
-              <w:left w:val="single" w:sz="4" w:color="BFBFBF"/>
-              <w:bottom w:val="single" w:sz="4" w:color="BFBFBF"/>
-              <w:right w:val="single" w:sz="4" w:color="BFBFBF"/>
-            </w:tcBorders>
-          </w:tcPr>
-          <w:p>
-            <w:pPr>
-              <w:spacing w:before="40" w:after="40"/>
-            </w:pPr>
-            <w:r/>
-            <w:r>
-              <w:rPr>
-                <w:rFonts w:ascii="Calibri" w:hAnsi="Calibri" w:eastAsia="Calibri"/>
-                <w:b w:val="0"/>
-                <w:i/>
-                <w:color w:val="666666"/>
-                <w:sz w:val="18"/>
-              </w:rPr>
-              <w:t>[ Always / Sometimes / Once ]</w:t>
-            </w:r>
-          </w:p>
-        </w:tc>
-      </w:tr>
-      <w:tr>
-        <w:tc>
-          <w:tcPr>
-            <w:tcW w:type="dxa" w:w="4986"/>
-            <w:shd w:fill="E7E6E6" w:val="clear"/>
-            <w:tcBorders>
-              <w:top w:val="single" w:sz="4" w:color="BFBFBF"/>
-              <w:left w:val="single" w:sz="4" w:color="BFBFBF"/>
-              <w:bottom w:val="single" w:sz="4" w:color="BFBFBF"/>
-              <w:right w:val="single" w:sz="4" w:color="BFBFBF"/>
-            </w:tcBorders>
-          </w:tcPr>
-          <w:p>
-            <w:pPr>
-              <w:spacing w:before="40" w:after="40"/>
-            </w:pPr>
-            <w:r/>
-            <w:r>
-              <w:rPr>
-                <w:rFonts w:ascii="Calibri" w:hAnsi="Calibri" w:eastAsia="Calibri"/>
-                <w:b/>
-                <w:i w:val="0"/>
-                <w:color w:val="1F4E79"/>
-                <w:sz w:val="18"/>
-              </w:rPr>
-              <w:t>Related to</w:t>
-            </w:r>
-          </w:p>
-        </w:tc>
-        <w:tc>
-          <w:tcPr>
-            <w:tcW w:type="dxa" w:w="4986"/>
-            <w:tcBorders>
-              <w:top w:val="single" w:sz="4" w:color="BFBFBF"/>
-              <w:left w:val="single" w:sz="4" w:color="BFBFBF"/>
-              <w:bottom w:val="single" w:sz="4" w:color="BFBFBF"/>
-              <w:right w:val="single" w:sz="4" w:color="BFBFBF"/>
-            </w:tcBorders>
-          </w:tcPr>
-          <w:p>
-            <w:pPr>
-              <w:spacing w:before="40" w:after="40"/>
-            </w:pPr>
-            <w:r/>
-            <w:r>
-              <w:rPr>
-                <w:rFonts w:ascii="Calibri" w:hAnsi="Calibri" w:eastAsia="Calibri"/>
-                <w:b w:val="0"/>
-                <w:i/>
-                <w:color w:val="666666"/>
-                <w:sz w:val="18"/>
-              </w:rPr>
-              <w:t>[ Optional secondary tag ]</w:t>
+              <w:t>State management / post-edit pipeline</w:t>
             </w:r>
           </w:p>
         </w:tc>
@@ -2269,10 +2277,10 @@
           <w:rFonts w:ascii="Calibri" w:hAnsi="Calibri" w:eastAsia="Calibri"/>
           <w:b w:val="0"/>
           <w:i w:val="0"/>
-          <w:color w:val="666666"/>
+          <w:color w:val="333333"/>
           <w:sz w:val="20"/>
         </w:rPr>
-        <w:t>1. _______________________________________________</w:t>
+        <w:t>1. Open the Auto Background Remover app and tap Background Remove (single image).</w:t>
       </w:r>
     </w:p>
     <w:p>
@@ -2285,10 +2293,10 @@
           <w:rFonts w:ascii="Calibri" w:hAnsi="Calibri" w:eastAsia="Calibri"/>
           <w:b w:val="0"/>
           <w:i w:val="0"/>
-          <w:color w:val="666666"/>
+          <w:color w:val="333333"/>
           <w:sz w:val="20"/>
         </w:rPr>
-        <w:t>2. _______________________________________________</w:t>
+        <w:t>2. Upload / select an image from the Gallery.</w:t>
       </w:r>
     </w:p>
     <w:p>
@@ -2301,10 +2309,10 @@
           <w:rFonts w:ascii="Calibri" w:hAnsi="Calibri" w:eastAsia="Calibri"/>
           <w:b w:val="0"/>
           <w:i w:val="0"/>
-          <w:color w:val="666666"/>
+          <w:color w:val="333333"/>
           <w:sz w:val="20"/>
         </w:rPr>
-        <w:t>3. _______________________________________________</w:t>
+        <w:t>3. Wait for the automatic AI background removal to complete — subject appears with background cleared.</w:t>
       </w:r>
     </w:p>
     <w:p>
@@ -2317,10 +2325,10 @@
           <w:rFonts w:ascii="Calibri" w:hAnsi="Calibri" w:eastAsia="Calibri"/>
           <w:b w:val="0"/>
           <w:i w:val="0"/>
-          <w:color w:val="666666"/>
+          <w:color w:val="333333"/>
           <w:sz w:val="20"/>
         </w:rPr>
-        <w:t>4. _______________________________________________</w:t>
+        <w:t>4. Open / tap the Shape feature (intended to reshape the cleared-background image).</w:t>
       </w:r>
     </w:p>
     <w:p>
@@ -2333,10 +2341,10 @@
           <w:rFonts w:ascii="Calibri" w:hAnsi="Calibri" w:eastAsia="Calibri"/>
           <w:b w:val="0"/>
           <w:i w:val="0"/>
-          <w:color w:val="666666"/>
+          <w:color w:val="333333"/>
           <w:sz w:val="20"/>
         </w:rPr>
-        <w:t>5. _______________________________________________</w:t>
+        <w:t>5. Apply or interact with Shape (change shape / confirm reshape action).</w:t>
       </w:r>
     </w:p>
     <w:p>
@@ -2349,10 +2357,10 @@
           <w:rFonts w:ascii="Calibri" w:hAnsi="Calibri" w:eastAsia="Calibri"/>
           <w:b w:val="0"/>
           <w:i w:val="0"/>
-          <w:color w:val="666666"/>
+          <w:color w:val="333333"/>
           <w:sz w:val="20"/>
         </w:rPr>
-        <w:t>6. _______________________________________________</w:t>
+        <w:t>6. Observe the preview/result image after Shape is applied.</w:t>
       </w:r>
     </w:p>
     <w:p>
@@ -2378,11 +2386,11 @@
         <w:rPr>
           <w:rFonts w:ascii="Calibri" w:hAnsi="Calibri" w:eastAsia="Calibri"/>
           <w:b w:val="0"/>
-          <w:i/>
+          <w:i w:val="0"/>
           <w:color w:val="333333"/>
           <w:sz w:val="20"/>
         </w:rPr>
-        <w:t>[ What should happen if the app worked correctly ]</w:t>
+        <w:t>Shape should apply to the current background-removed image. The cleared background must be preserved; only the shape/mask of the already-processed (BG-removed) image should change.</w:t>
       </w:r>
     </w:p>
     <w:p>
@@ -2408,11 +2416,11 @@
         <w:rPr>
           <w:rFonts w:ascii="Calibri" w:hAnsi="Calibri" w:eastAsia="Calibri"/>
           <w:b w:val="0"/>
-          <w:i/>
+          <w:i w:val="0"/>
           <w:color w:val="333333"/>
           <w:sz w:val="20"/>
         </w:rPr>
-        <w:t>[ What actually happened — be specific ]</w:t>
+        <w:t>After using Shape, the image reverts to the original photo with the old background restored. Shape appears to operate on the original source image instead of the BG-removed result, so the app “forgets” the already-cleared background state. If Shape is opened but no shape change is applied, returning shows the BG-removed image again (expected). The defect appears only when Shape changes are applied.</w:t>
       </w:r>
     </w:p>
     <w:p>
@@ -2510,11 +2518,11 @@
         <w:rPr>
           <w:rFonts w:ascii="Calibri" w:hAnsi="Calibri" w:eastAsia="Calibri"/>
           <w:b w:val="0"/>
-          <w:i/>
+          <w:i w:val="0"/>
           <w:color w:val="333333"/>
           <w:sz w:val="20"/>
         </w:rPr>
-        <w:t>[ Optional: impact on user, any workaround, related screens ]</w:t>
+        <w:t>Impact: Users lose the successful AI BG-removal result as soon as they use Shape, which breaks the post-edit workflow. Likely root cause: Shape feature loads/transforms the original uploaded bitmap instead of the processed transparent/BG-removed bitmap (state not retained across tools). Evidence needed: (1) screenshot after auto BG remove, (2) screenshot after applying Shape showing BG restored. Optional: short screen recording of the full flow.</w:t>
       </w:r>
     </w:p>
     <w:p>
@@ -11215,6 +11223,197 @@
           </w:p>
         </w:tc>
       </w:tr>
+      <w:tr>
+        <w:tc>
+          <w:tcPr>
+            <w:shd w:fill="FFFFFF" w:val="clear"/>
+            <w:tcBorders>
+              <w:top w:val="single" w:sz="4" w:color="BFBFBF"/>
+              <w:left w:val="single" w:sz="4" w:color="BFBFBF"/>
+              <w:bottom w:val="single" w:sz="4" w:color="BFBFBF"/>
+              <w:right w:val="single" w:sz="4" w:color="BFBFBF"/>
+            </w:tcBorders>
+          </w:tcPr>
+          <w:p>
+            <w:pPr>
+              <w:spacing w:before="40" w:after="40"/>
+            </w:pPr>
+            <w:r/>
+            <w:r>
+              <w:rPr>
+                <w:rFonts w:ascii="Calibri" w:hAnsi="Calibri" w:eastAsia="Calibri"/>
+                <w:b w:val="0"/>
+                <w:i w:val="0"/>
+                <w:color w:val="333333"/>
+                <w:sz w:val="16"/>
+              </w:rPr>
+              <w:t>TC-BR-013</w:t>
+            </w:r>
+          </w:p>
+        </w:tc>
+        <w:tc>
+          <w:tcPr>
+            <w:shd w:fill="FFFFFF" w:val="clear"/>
+            <w:tcBorders>
+              <w:top w:val="single" w:sz="4" w:color="BFBFBF"/>
+              <w:left w:val="single" w:sz="4" w:color="BFBFBF"/>
+              <w:bottom w:val="single" w:sz="4" w:color="BFBFBF"/>
+              <w:right w:val="single" w:sz="4" w:color="BFBFBF"/>
+            </w:tcBorders>
+          </w:tcPr>
+          <w:p>
+            <w:pPr>
+              <w:spacing w:before="40" w:after="40"/>
+            </w:pPr>
+            <w:r/>
+            <w:r>
+              <w:rPr>
+                <w:rFonts w:ascii="Calibri" w:hAnsi="Calibri" w:eastAsia="Calibri"/>
+                <w:b w:val="0"/>
+                <w:i w:val="0"/>
+                <w:color w:val="333333"/>
+                <w:sz w:val="16"/>
+              </w:rPr>
+              <w:t>Shape after auto BG remove preserves cleared state</w:t>
+            </w:r>
+          </w:p>
+        </w:tc>
+        <w:tc>
+          <w:tcPr>
+            <w:shd w:fill="FFFFFF" w:val="clear"/>
+            <w:tcBorders>
+              <w:top w:val="single" w:sz="4" w:color="BFBFBF"/>
+              <w:left w:val="single" w:sz="4" w:color="BFBFBF"/>
+              <w:bottom w:val="single" w:sz="4" w:color="BFBFBF"/>
+              <w:right w:val="single" w:sz="4" w:color="BFBFBF"/>
+            </w:tcBorders>
+          </w:tcPr>
+          <w:p>
+            <w:pPr>
+              <w:spacing w:before="40" w:after="40"/>
+            </w:pPr>
+            <w:r/>
+            <w:r>
+              <w:rPr>
+                <w:rFonts w:ascii="Calibri" w:hAnsi="Calibri" w:eastAsia="Calibri"/>
+                <w:b w:val="0"/>
+                <w:i w:val="0"/>
+                <w:color w:val="333333"/>
+                <w:sz w:val="16"/>
+              </w:rPr>
+              <w:t>Functionality / Stability</w:t>
+            </w:r>
+          </w:p>
+        </w:tc>
+        <w:tc>
+          <w:tcPr>
+            <w:shd w:fill="FFFFFF" w:val="clear"/>
+            <w:tcBorders>
+              <w:top w:val="single" w:sz="4" w:color="BFBFBF"/>
+              <w:left w:val="single" w:sz="4" w:color="BFBFBF"/>
+              <w:bottom w:val="single" w:sz="4" w:color="BFBFBF"/>
+              <w:right w:val="single" w:sz="4" w:color="BFBFBF"/>
+            </w:tcBorders>
+          </w:tcPr>
+          <w:p>
+            <w:pPr>
+              <w:spacing w:before="40" w:after="40"/>
+            </w:pPr>
+            <w:r/>
+            <w:r>
+              <w:rPr>
+                <w:rFonts w:ascii="Calibri" w:hAnsi="Calibri" w:eastAsia="Calibri"/>
+                <w:b w:val="0"/>
+                <w:i w:val="0"/>
+                <w:color w:val="333333"/>
+                <w:sz w:val="16"/>
+              </w:rPr>
+              <w:t>BG remove → apply Shape</w:t>
+            </w:r>
+          </w:p>
+        </w:tc>
+        <w:tc>
+          <w:tcPr>
+            <w:shd w:fill="FFFFFF" w:val="clear"/>
+            <w:tcBorders>
+              <w:top w:val="single" w:sz="4" w:color="BFBFBF"/>
+              <w:left w:val="single" w:sz="4" w:color="BFBFBF"/>
+              <w:bottom w:val="single" w:sz="4" w:color="BFBFBF"/>
+              <w:right w:val="single" w:sz="4" w:color="BFBFBF"/>
+            </w:tcBorders>
+          </w:tcPr>
+          <w:p>
+            <w:pPr>
+              <w:spacing w:before="40" w:after="40"/>
+            </w:pPr>
+            <w:r/>
+            <w:r>
+              <w:rPr>
+                <w:rFonts w:ascii="Calibri" w:hAnsi="Calibri" w:eastAsia="Calibri"/>
+                <w:b w:val="0"/>
+                <w:i w:val="0"/>
+                <w:color w:val="333333"/>
+                <w:sz w:val="16"/>
+              </w:rPr>
+              <w:t>Shape edits BG-removed image; original BG must not return</w:t>
+            </w:r>
+          </w:p>
+        </w:tc>
+        <w:tc>
+          <w:tcPr>
+            <w:shd w:fill="FCE4D6" w:val="clear"/>
+            <w:tcBorders>
+              <w:top w:val="single" w:sz="4" w:color="BFBFBF"/>
+              <w:left w:val="single" w:sz="4" w:color="BFBFBF"/>
+              <w:bottom w:val="single" w:sz="4" w:color="BFBFBF"/>
+              <w:right w:val="single" w:sz="4" w:color="BFBFBF"/>
+            </w:tcBorders>
+          </w:tcPr>
+          <w:p>
+            <w:pPr>
+              <w:spacing w:before="40" w:after="40"/>
+            </w:pPr>
+            <w:r/>
+            <w:r>
+              <w:rPr>
+                <w:rFonts w:ascii="Calibri" w:hAnsi="Calibri" w:eastAsia="Calibri"/>
+                <w:b w:val="0"/>
+                <w:i w:val="0"/>
+                <w:color w:val="333333"/>
+                <w:sz w:val="16"/>
+              </w:rPr>
+              <w:t>Fail</w:t>
+            </w:r>
+          </w:p>
+        </w:tc>
+        <w:tc>
+          <w:tcPr>
+            <w:shd w:fill="FCE4D6" w:val="clear"/>
+            <w:tcBorders>
+              <w:top w:val="single" w:sz="4" w:color="BFBFBF"/>
+              <w:left w:val="single" w:sz="4" w:color="BFBFBF"/>
+              <w:bottom w:val="single" w:sz="4" w:color="BFBFBF"/>
+              <w:right w:val="single" w:sz="4" w:color="BFBFBF"/>
+            </w:tcBorders>
+          </w:tcPr>
+          <w:p>
+            <w:pPr>
+              <w:spacing w:before="40" w:after="40"/>
+            </w:pPr>
+            <w:r/>
+            <w:r>
+              <w:rPr>
+                <w:rFonts w:ascii="Calibri" w:hAnsi="Calibri" w:eastAsia="Calibri"/>
+                <w:b w:val="0"/>
+                <w:i w:val="0"/>
+                <w:color w:val="333333"/>
+                <w:sz w:val="16"/>
+              </w:rPr>
+              <w:t>BUG-001</w:t>
+            </w:r>
+          </w:p>
+        </w:tc>
+      </w:tr>
     </w:tbl>
     <w:p/>
     <w:p>
@@ -15313,6 +15512,7 @@
         <w:tc>
           <w:tcPr>
             <w:tcW w:type="dxa" w:w="4986"/>
+            <w:shd w:fill="FFFFFF" w:val="clear"/>
             <w:tcBorders>
               <w:top w:val="single" w:sz="4" w:color="BFBFBF"/>
               <w:left w:val="single" w:sz="4" w:color="BFBFBF"/>
@@ -15329,11 +15529,11 @@
               <w:rPr>
                 <w:rFonts w:ascii="Calibri" w:hAnsi="Calibri" w:eastAsia="Calibri"/>
                 <w:b w:val="0"/>
-                <w:i/>
-                <w:color w:val="666666"/>
+                <w:i w:val="0"/>
+                <w:color w:val="333333"/>
                 <w:sz w:val="18"/>
               </w:rPr>
-              <w:t>[ count ]  — Critical: __  High: __  Medium: __  Low: __</w:t>
+              <w:t>1  — Critical: 0  High: 1  Medium: 0  Low: 0</w:t>
             </w:r>
           </w:p>
         </w:tc>
@@ -15370,6 +15570,7 @@
         <w:tc>
           <w:tcPr>
             <w:tcW w:type="dxa" w:w="4986"/>
+            <w:shd w:fill="FFFFFF" w:val="clear"/>
             <w:tcBorders>
               <w:top w:val="single" w:sz="4" w:color="BFBFBF"/>
               <w:left w:val="single" w:sz="4" w:color="BFBFBF"/>
@@ -15386,11 +15587,11 @@
               <w:rPr>
                 <w:rFonts w:ascii="Calibri" w:hAnsi="Calibri" w:eastAsia="Calibri"/>
                 <w:b w:val="0"/>
-                <w:i/>
-                <w:color w:val="666666"/>
+                <w:i w:val="0"/>
+                <w:color w:val="333333"/>
                 <w:sz w:val="18"/>
               </w:rPr>
-              <w:t>Func: __  Workflow: __  Stability: __  Usability: __  Perf: __</w:t>
+              <w:t>Func: 1  Workflow: 0  Stability: 1  Usability: 0  Perf: 0</w:t>
             </w:r>
           </w:p>
         </w:tc>

</xml_diff>